<commit_message>
docs(readme): agregado de documentación y modificación de readme
</commit_message>
<xml_diff>
--- a/Docs/Reporte_Sprint01_Proy02.docx
+++ b/Docs/Reporte_Sprint01_Proy02.docx
@@ -43,6 +43,7 @@
         </w:p>
         <w:p>
           <w:pPr>
+            <w:keepNext/>
             <w:rPr>
               <w:b/>
               <w:bCs/>
@@ -59,9 +60,12 @@
             </w:rPr>
             <w:t>FACULTAD DE INGENIERÍA EN ELECTRICIDAD Y COMPUTACIÓN</w:t>
           </w:r>
+          <w:bookmarkStart w:id="0" w:name="_GoBack"/>
+          <w:bookmarkEnd w:id="0"/>
         </w:p>
         <w:p>
           <w:pPr>
+            <w:keepNext/>
             <w:rPr>
               <w:rFonts w:cstheme="minorHAnsi"/>
               <w:b/>
@@ -159,7 +163,7 @@
                                   <w:tag w:val=""/>
                                   <w:id w:val="400952559"/>
                                   <w:dataBinding w:prefixMappings="xmlns:ns0='http://schemas.microsoft.com/office/2006/coverPageProps' " w:xpath="/ns0:CoverPageProperties[1]/ns0:PublishDate[1]" w:storeItemID="{55AF091B-3C7A-41E3-B477-F2FDAA23CFDA}"/>
-                                  <w:date w:fullDate="2026-10-15T00:00:00Z">
+                                  <w:date>
                                     <w:dateFormat w:val="d 'de' MMMM 'de' yyyy"/>
                                     <w:lid w:val="es-ES"/>
                                     <w:storeMappedDataAs w:val="dateTime"/>
@@ -187,7 +191,7 @@
                                         <w:szCs w:val="40"/>
                                         <w:lang w:val="es-ES"/>
                                       </w:rPr>
-                                      <w:t>15 de octubre de 2026</w:t>
+                                      <w:t>23 de octubre de 2026</w:t>
                                     </w:r>
                                   </w:p>
                                 </w:sdtContent>
@@ -234,7 +238,7 @@
                             <w:tag w:val=""/>
                             <w:id w:val="400952559"/>
                             <w:dataBinding w:prefixMappings="xmlns:ns0='http://schemas.microsoft.com/office/2006/coverPageProps' " w:xpath="/ns0:CoverPageProperties[1]/ns0:PublishDate[1]" w:storeItemID="{55AF091B-3C7A-41E3-B477-F2FDAA23CFDA}"/>
-                            <w:date w:fullDate="2026-10-15T00:00:00Z">
+                            <w:date>
                               <w:dateFormat w:val="d 'de' MMMM 'de' yyyy"/>
                               <w:lid w:val="es-ES"/>
                               <w:storeMappedDataAs w:val="dateTime"/>
@@ -262,7 +266,7 @@
                                   <w:szCs w:val="40"/>
                                   <w:lang w:val="es-ES"/>
                                 </w:rPr>
-                                <w:t>15 de octubre de 2026</w:t>
+                                <w:t>23 de octubre de 2026</w:t>
                               </w:r>
                             </w:p>
                           </w:sdtContent>
@@ -654,17 +658,7 @@
                                         <w:szCs w:val="52"/>
                                         <w:lang w:val="es-ES"/>
                                       </w:rPr>
-                                      <w:t xml:space="preserve">PROYECTO </w:t>
-                                    </w:r>
-                                    <w:r>
-                                      <w:rPr>
-                                        <w:caps/>
-                                        <w:color w:val="17365D" w:themeColor="text2" w:themeShade="BF"/>
-                                        <w:sz w:val="52"/>
-                                        <w:szCs w:val="52"/>
-                                        <w:lang w:val="es-ES"/>
-                                      </w:rPr>
-                                      <w:t>02</w:t>
+                                      <w:t>PROYECTO 02</w:t>
                                     </w:r>
                                   </w:sdtContent>
                                 </w:sdt>
@@ -770,17 +764,7 @@
                                   <w:szCs w:val="52"/>
                                   <w:lang w:val="es-ES"/>
                                 </w:rPr>
-                                <w:t xml:space="preserve">PROYECTO </w:t>
-                              </w:r>
-                              <w:r>
-                                <w:rPr>
-                                  <w:caps/>
-                                  <w:color w:val="17365D" w:themeColor="text2" w:themeShade="BF"/>
-                                  <w:sz w:val="52"/>
-                                  <w:szCs w:val="52"/>
-                                  <w:lang w:val="es-ES"/>
-                                </w:rPr>
-                                <w:t>02</w:t>
+                                <w:t xml:space="preserve">PROYECTO 02</w:t>
                               </w:r>
                             </w:sdtContent>
                           </w:sdt>
@@ -1351,7 +1335,7 @@
                     <w:noProof/>
                     <w:webHidden/>
                   </w:rPr>
-                  <w:t>6</w:t>
+                  <w:t>7</w:t>
                 </w:r>
                 <w:r>
                   <w:rPr>
@@ -1426,7 +1410,7 @@
                     <w:noProof/>
                     <w:webHidden/>
                   </w:rPr>
-                  <w:t>6</w:t>
+                  <w:t>11</w:t>
                 </w:r>
                 <w:r>
                   <w:rPr>
@@ -1501,7 +1485,7 @@
                     <w:noProof/>
                     <w:webHidden/>
                   </w:rPr>
-                  <w:t>7</w:t>
+                  <w:t>12</w:t>
                 </w:r>
                 <w:r>
                   <w:rPr>
@@ -1525,6 +1509,7 @@
         </w:sdt>
         <w:p>
           <w:pPr>
+            <w:keepNext/>
             <w:rPr>
               <w:rFonts w:cstheme="minorHAnsi"/>
               <w:b/>
@@ -1560,7 +1545,7 @@
           <w:lang w:val="es-EC"/>
         </w:rPr>
       </w:pPr>
-      <w:bookmarkStart w:id="0" w:name="_Toc229685202"/>
+      <w:bookmarkStart w:id="1" w:name="_Toc229685202"/>
       <w:r>
         <w:rPr>
           <w:lang w:val="es-EC"/>
@@ -1568,8 +1553,6 @@
         <w:lastRenderedPageBreak/>
         <w:t>Análisis</w:t>
       </w:r>
-      <w:bookmarkStart w:id="1" w:name="_GoBack"/>
-      <w:bookmarkEnd w:id="0"/>
       <w:bookmarkEnd w:id="1"/>
     </w:p>
     <w:p>
@@ -1582,21 +1565,7 @@
         <w:rPr>
           <w:lang w:val="es-EC"/>
         </w:rPr>
-        <w:t xml:space="preserve">Después de un análisis de la información recopilada de las entrevistas durante el evento de fiestas </w:t>
-      </w:r>
-      <w:proofErr w:type="spellStart"/>
-      <w:r>
-        <w:rPr>
-          <w:lang w:val="es-EC"/>
-        </w:rPr>
-        <w:t>octubrinas</w:t>
-      </w:r>
-      <w:proofErr w:type="spellEnd"/>
-      <w:r>
-        <w:rPr>
-          <w:lang w:val="es-EC"/>
-        </w:rPr>
-        <w:t xml:space="preserve"> en la Gallegos Lara, pudimos llegar a la siguiente organización de la información que iría incluida en el sitio web:</w:t>
+        <w:t>Después de un análisis de la información recopilada de las entrevistas durante el evento de fiestas octubrinas en la Gallegos Lara, pudimos llegar a la siguiente organización de la información que iría incluida en el sitio web:</w:t>
       </w:r>
     </w:p>
     <w:tbl>
@@ -1748,28 +1717,7 @@
                 <w:rFonts w:asciiTheme="minorHAnsi" w:hAnsiTheme="minorHAnsi" w:cstheme="minorHAnsi"/>
                 <w:lang w:val="es-EC"/>
               </w:rPr>
-              <w:t>Título del event</w:t>
-            </w:r>
-            <w:r>
-              <w:rPr>
-                <w:rFonts w:asciiTheme="minorHAnsi" w:hAnsiTheme="minorHAnsi" w:cstheme="minorHAnsi"/>
-                <w:lang w:val="es-EC"/>
-              </w:rPr>
-              <w:t>o: “</w:t>
-            </w:r>
-            <w:r>
-              <w:rPr>
-                <w:rFonts w:asciiTheme="minorHAnsi" w:hAnsiTheme="minorHAnsi" w:cstheme="minorHAnsi"/>
-                <w:lang w:val="es-EC"/>
-              </w:rPr>
-              <w:t>Tradi</w:t>
-            </w:r>
-            <w:r>
-              <w:rPr>
-                <w:rFonts w:asciiTheme="minorHAnsi" w:hAnsiTheme="minorHAnsi" w:cstheme="minorHAnsi"/>
-                <w:lang w:val="es-EC"/>
-              </w:rPr>
-              <w:t>ciones y niñez en la comunidad”.</w:t>
+              <w:t>Título del evento: “Tradiciones y niñez en la comunidad”.</w:t>
             </w:r>
           </w:p>
           <w:p>
@@ -1790,14 +1738,7 @@
                 <w:rFonts w:asciiTheme="minorHAnsi" w:hAnsiTheme="minorHAnsi" w:cstheme="minorHAnsi"/>
                 <w:lang w:val="es-EC"/>
               </w:rPr>
-              <w:t>Ubicación: Espacio público, calle principal de la Gallegos Lar</w:t>
-            </w:r>
-            <w:r>
-              <w:rPr>
-                <w:rFonts w:asciiTheme="minorHAnsi" w:hAnsiTheme="minorHAnsi" w:cstheme="minorHAnsi"/>
-                <w:lang w:val="es-EC"/>
-              </w:rPr>
-              <w:t>a.</w:t>
+              <w:t>Ubicación: Espacio público, calle principal de la Gallegos Lara.</w:t>
             </w:r>
           </w:p>
           <w:p>
@@ -1819,6 +1760,27 @@
                 <w:lang w:val="es-EC"/>
               </w:rPr>
               <w:t>Breve eslogan o llamada a la acción sobre la memoria recreativa y la unión intergeneracional.</w:t>
+            </w:r>
+          </w:p>
+          <w:p>
+            <w:pPr>
+              <w:pStyle w:val="Prrafodelista"/>
+              <w:numPr>
+                <w:ilvl w:val="0"/>
+                <w:numId w:val="9"/>
+              </w:numPr>
+              <w:jc w:val="both"/>
+              <w:rPr>
+                <w:rFonts w:asciiTheme="minorHAnsi" w:hAnsiTheme="minorHAnsi" w:cstheme="minorHAnsi"/>
+                <w:lang w:val="es-EC"/>
+              </w:rPr>
+            </w:pPr>
+            <w:r>
+              <w:rPr>
+                <w:rFonts w:asciiTheme="minorHAnsi" w:hAnsiTheme="minorHAnsi" w:cstheme="minorHAnsi"/>
+                <w:lang w:val="es-EC"/>
+              </w:rPr>
+              <w:t>Fotografía de fondo: público reunido alrededor del torneo nocturno.</w:t>
             </w:r>
           </w:p>
         </w:tc>
@@ -1915,21 +1877,7 @@
                 <w:rFonts w:asciiTheme="minorHAnsi" w:hAnsiTheme="minorHAnsi" w:cstheme="minorHAnsi"/>
                 <w:lang w:val="es-EC"/>
               </w:rPr>
-              <w:t>Importancia cultural: Fomento de la conversación entre</w:t>
-            </w:r>
-            <w:r>
-              <w:rPr>
-                <w:rFonts w:asciiTheme="minorHAnsi" w:hAnsiTheme="minorHAnsi" w:cstheme="minorHAnsi"/>
-                <w:lang w:val="es-EC"/>
-              </w:rPr>
-              <w:t xml:space="preserve"> generaciones, identidad del barrio</w:t>
-            </w:r>
-            <w:r>
-              <w:rPr>
-                <w:rFonts w:asciiTheme="minorHAnsi" w:hAnsiTheme="minorHAnsi" w:cstheme="minorHAnsi"/>
-                <w:lang w:val="es-EC"/>
-              </w:rPr>
-              <w:t xml:space="preserve"> y análisis de la transformación de los espacios públicos.   </w:t>
+              <w:t xml:space="preserve">Importancia cultural: Fomento de la conversación entre generaciones, identidad del barrio y análisis de la transformación de los espacios públicos.   </w:t>
             </w:r>
           </w:p>
         </w:tc>
@@ -2026,23 +1974,7 @@
                 <w:rFonts w:asciiTheme="minorHAnsi" w:hAnsiTheme="minorHAnsi" w:cstheme="minorHAnsi"/>
                 <w:lang w:val="es-EC"/>
               </w:rPr>
-              <w:t xml:space="preserve">Perspectiva de niños y jóvenes: Mayor afinidad hacia los videojuegos (como </w:t>
-            </w:r>
-            <w:proofErr w:type="spellStart"/>
-            <w:r>
-              <w:rPr>
-                <w:rFonts w:asciiTheme="minorHAnsi" w:hAnsiTheme="minorHAnsi" w:cstheme="minorHAnsi"/>
-                <w:lang w:val="es-EC"/>
-              </w:rPr>
-              <w:t>Roblox</w:t>
-            </w:r>
-            <w:proofErr w:type="spellEnd"/>
-            <w:r>
-              <w:rPr>
-                <w:rFonts w:asciiTheme="minorHAnsi" w:hAnsiTheme="minorHAnsi" w:cstheme="minorHAnsi"/>
-                <w:lang w:val="es-EC"/>
-              </w:rPr>
-              <w:t>) y el entretenimiento en casa, combinados con prácticas deportivas organizadas como el fútbol</w:t>
+              <w:t>Perspectiva de niños y jóvenes: Mayor afinidad hacia los videojuegos (como Roblox) y el entretenimiento en casa, combinados con prácticas deportivas organizadas como el fútbol</w:t>
             </w:r>
             <w:r>
               <w:rPr>
@@ -2125,23 +2057,7 @@
                 <w:rFonts w:asciiTheme="minorHAnsi" w:hAnsiTheme="minorHAnsi" w:cstheme="minorHAnsi"/>
                 <w:lang w:val="es-EC"/>
               </w:rPr>
-              <w:t xml:space="preserve">Juegos tradicionales del pasado: Trompo con piola, </w:t>
-            </w:r>
-            <w:proofErr w:type="spellStart"/>
-            <w:r>
-              <w:rPr>
-                <w:rFonts w:asciiTheme="minorHAnsi" w:hAnsiTheme="minorHAnsi" w:cstheme="minorHAnsi"/>
-                <w:lang w:val="es-EC"/>
-              </w:rPr>
-              <w:t>bolichas</w:t>
-            </w:r>
-            <w:proofErr w:type="spellEnd"/>
-            <w:r>
-              <w:rPr>
-                <w:rFonts w:asciiTheme="minorHAnsi" w:hAnsiTheme="minorHAnsi" w:cstheme="minorHAnsi"/>
-                <w:lang w:val="es-EC"/>
-              </w:rPr>
-              <w:t>/canicas, rayuela, ensacados, zancos de lata y cometas de papel.</w:t>
+              <w:t>Juegos tradicionales del pasado: Trompo con piola, bolichas/canicas, rayuela, ensacados, zancos de lata y cometas de papel.</w:t>
             </w:r>
           </w:p>
           <w:p>
@@ -2162,31 +2078,8 @@
                 <w:rFonts w:asciiTheme="minorHAnsi" w:hAnsiTheme="minorHAnsi" w:cstheme="minorHAnsi"/>
                 <w:lang w:val="es-EC"/>
               </w:rPr>
-              <w:t xml:space="preserve">Dinámicas actuales: Uso de teléfonos celulares, </w:t>
-            </w:r>
-            <w:proofErr w:type="spellStart"/>
-            <w:r>
-              <w:rPr>
-                <w:rFonts w:asciiTheme="minorHAnsi" w:hAnsiTheme="minorHAnsi" w:cstheme="minorHAnsi"/>
-                <w:lang w:val="es-EC"/>
-              </w:rPr>
-              <w:t>tablets</w:t>
-            </w:r>
-            <w:proofErr w:type="spellEnd"/>
-            <w:r>
-              <w:rPr>
-                <w:rFonts w:asciiTheme="minorHAnsi" w:hAnsiTheme="minorHAnsi" w:cstheme="minorHAnsi"/>
-                <w:lang w:val="es-EC"/>
-              </w:rPr>
-              <w:t xml:space="preserve">, videojuegos y entrenamientos </w:t>
-            </w:r>
-            <w:r>
-              <w:rPr>
-                <w:rFonts w:asciiTheme="minorHAnsi" w:hAnsiTheme="minorHAnsi" w:cstheme="minorHAnsi"/>
-                <w:lang w:val="es-EC"/>
-              </w:rPr>
               <w:lastRenderedPageBreak/>
-              <w:t>deportivos específicos.</w:t>
+              <w:t>Dinámicas actuales: Uso de teléfonos celulares, tablets, videojuegos y entrenamientos deportivos específicos.</w:t>
             </w:r>
           </w:p>
           <w:p>
@@ -2382,7 +2275,7 @@
                 <w:rFonts w:asciiTheme="minorHAnsi" w:hAnsiTheme="minorHAnsi" w:cstheme="minorHAnsi"/>
                 <w:lang w:val="es-EC"/>
               </w:rPr>
-              <w:t>Fotografías del registro de entrevistas realizadas en la calle principal de la Gallegos Lara.</w:t>
+              <w:t>Video principal del juego de la silla musical y tres videos cortos de dinámicas nocturnas y diurnas.</w:t>
             </w:r>
           </w:p>
           <w:p>
@@ -2403,39 +2296,147 @@
                 <w:rFonts w:asciiTheme="minorHAnsi" w:hAnsiTheme="minorHAnsi" w:cstheme="minorHAnsi"/>
                 <w:lang w:val="es-EC"/>
               </w:rPr>
-              <w:t>Imágenes de interacción entre los entrevistadores (</w:t>
+              <w:t>Fotografías de las entrevistas y de los partidos del torneo barrial (infantil, femenino y nocturno).</w:t>
             </w:r>
-            <w:proofErr w:type="spellStart"/>
+          </w:p>
+          <w:p>
+            <w:pPr>
+              <w:pStyle w:val="Prrafodelista"/>
+              <w:numPr>
+                <w:ilvl w:val="0"/>
+                <w:numId w:val="10"/>
+              </w:numPr>
+              <w:jc w:val="both"/>
+              <w:rPr>
+                <w:rFonts w:asciiTheme="minorHAnsi" w:hAnsiTheme="minorHAnsi" w:cstheme="minorHAnsi"/>
+                <w:lang w:val="es-EC"/>
+              </w:rPr>
+            </w:pPr>
             <w:r>
               <w:rPr>
                 <w:rFonts w:asciiTheme="minorHAnsi" w:hAnsiTheme="minorHAnsi" w:cstheme="minorHAnsi"/>
                 <w:lang w:val="es-EC"/>
               </w:rPr>
-              <w:t>Mathias</w:t>
+              <w:t>Visor que amplía cada fotografía al hacer clic, con su descripción y un botón para cerrarla.</w:t>
             </w:r>
-            <w:proofErr w:type="spellEnd"/>
+          </w:p>
+        </w:tc>
+      </w:tr>
+      <w:tr>
+        <w:tc>
+          <w:tcPr>
+            <w:tcW w:w="2235" w:type="dxa"/>
+            <w:vAlign w:val="center"/>
+          </w:tcPr>
+          <w:p>
+            <w:pPr>
+              <w:pStyle w:val="Prrafodelista"/>
+              <w:numPr>
+                <w:ilvl w:val="0"/>
+                <w:numId w:val="8"/>
+              </w:numPr>
+              <w:jc w:val="center"/>
+              <w:rPr>
+                <w:rFonts w:asciiTheme="minorHAnsi" w:hAnsiTheme="minorHAnsi" w:cstheme="minorHAnsi"/>
+                <w:lang w:val="es-EC"/>
+              </w:rPr>
+            </w:pPr>
             <w:r>
               <w:rPr>
                 <w:rFonts w:asciiTheme="minorHAnsi" w:hAnsiTheme="minorHAnsi" w:cstheme="minorHAnsi"/>
                 <w:lang w:val="es-EC"/>
               </w:rPr>
-              <w:t xml:space="preserve"> </w:t>
+              <w:t>Pie de página</w:t>
             </w:r>
-            <w:proofErr w:type="spellStart"/>
+          </w:p>
+        </w:tc>
+        <w:tc>
+          <w:tcPr>
+            <w:tcW w:w="3078" w:type="dxa"/>
+            <w:vAlign w:val="center"/>
+          </w:tcPr>
+          <w:p>
+            <w:pPr>
+              <w:jc w:val="center"/>
+              <w:rPr>
+                <w:rFonts w:cstheme="minorHAnsi"/>
+                <w:lang w:val="es-EC"/>
+              </w:rPr>
+            </w:pPr>
             <w:r>
               <w:rPr>
+                <w:rFonts w:cstheme="minorHAnsi"/>
+                <w:lang w:val="es-EC"/>
+              </w:rPr>
+              <w:t>Recoger las propuestas de los visitantes y presentar la información del equipo y del proyecto.</w:t>
+            </w:r>
+          </w:p>
+        </w:tc>
+        <w:tc>
+          <w:tcPr>
+            <w:tcW w:w="3407" w:type="dxa"/>
+          </w:tcPr>
+          <w:p>
+            <w:pPr>
+              <w:pStyle w:val="Prrafodelista"/>
+              <w:numPr>
+                <w:ilvl w:val="0"/>
+                <w:numId w:val="10"/>
+              </w:numPr>
+              <w:jc w:val="both"/>
+              <w:rPr>
                 <w:rFonts w:asciiTheme="minorHAnsi" w:hAnsiTheme="minorHAnsi" w:cstheme="minorHAnsi"/>
                 <w:lang w:val="es-EC"/>
               </w:rPr>
-              <w:t>Giler</w:t>
+            </w:pPr>
+            <w:r>
+              <w:rPr>
+                <w:rFonts w:asciiTheme="minorHAnsi" w:hAnsiTheme="minorHAnsi" w:cstheme="minorHAnsi"/>
+                <w:lang w:val="es-EC"/>
+              </w:rPr>
+              <w:t>Formulario “Déjanos tu propuesta para el barrio”.</w:t>
             </w:r>
-            <w:proofErr w:type="spellEnd"/>
+          </w:p>
+          <w:p>
+            <w:pPr>
+              <w:pStyle w:val="Prrafodelista"/>
+              <w:numPr>
+                <w:ilvl w:val="0"/>
+                <w:numId w:val="10"/>
+              </w:numPr>
+              <w:jc w:val="both"/>
+              <w:rPr>
+                <w:rFonts w:asciiTheme="minorHAnsi" w:hAnsiTheme="minorHAnsi" w:cstheme="minorHAnsi"/>
+                <w:lang w:val="es-EC"/>
+              </w:rPr>
+            </w:pPr>
             <w:r>
               <w:rPr>
                 <w:rFonts w:asciiTheme="minorHAnsi" w:hAnsiTheme="minorHAnsi" w:cstheme="minorHAnsi"/>
                 <w:lang w:val="es-EC"/>
               </w:rPr>
-              <w:t xml:space="preserve"> e Iván Alvarado) y los residentes de distintas edades.   </w:t>
+              <w:t>Institución, materia e integrantes del equipo.</w:t>
+            </w:r>
+          </w:p>
+          <w:p>
+            <w:pPr>
+              <w:pStyle w:val="Prrafodelista"/>
+              <w:numPr>
+                <w:ilvl w:val="0"/>
+                <w:numId w:val="10"/>
+              </w:numPr>
+              <w:jc w:val="both"/>
+              <w:rPr>
+                <w:rFonts w:asciiTheme="minorHAnsi" w:hAnsiTheme="minorHAnsi" w:cstheme="minorHAnsi"/>
+                <w:lang w:val="es-EC"/>
+              </w:rPr>
+            </w:pPr>
+            <w:r>
+              <w:rPr>
+                <w:rFonts w:asciiTheme="minorHAnsi" w:hAnsiTheme="minorHAnsi" w:cstheme="minorHAnsi"/>
+                <w:lang w:val="es-EC"/>
+              </w:rPr>
+              <w:t>Enlace al repositorio del proyecto en GitHub.</w:t>
             </w:r>
           </w:p>
         </w:tc>
@@ -2475,33 +2476,7 @@
         <w:rPr>
           <w:lang w:val="es-EC"/>
         </w:rPr>
-        <w:t xml:space="preserve">Como resultado de la evaluación de plantillas de HTML5UP, identificamos tres plantillas candidatas que consideramos serían adecuadas para el desarrollo de nuestra </w:t>
-      </w:r>
-      <w:proofErr w:type="spellStart"/>
-      <w:r>
-        <w:rPr>
-          <w:lang w:val="es-EC"/>
-        </w:rPr>
-        <w:t>landing</w:t>
-      </w:r>
-      <w:proofErr w:type="spellEnd"/>
-      <w:r>
-        <w:rPr>
-          <w:lang w:val="es-EC"/>
-        </w:rPr>
-        <w:t xml:space="preserve"> page</w:t>
-      </w:r>
-      <w:r>
-        <w:rPr>
-          <w:lang w:val="es-EC"/>
-        </w:rPr>
-        <w:t xml:space="preserve"> debido a su gran adaptabilidad para el tipo de contenido que presentaremos</w:t>
-      </w:r>
-      <w:r>
-        <w:rPr>
-          <w:lang w:val="es-EC"/>
-        </w:rPr>
-        <w:t>:</w:t>
+        <w:t>Como resultado de la evaluación de plantillas de HTML5 UP, identificamos tres plantillas candidatas que consideramos serían adecuadas para el desarrollo de nuestra landing page debido a su gran adaptabilidad para el tipo de contenido que presentaremos:</w:t>
       </w:r>
     </w:p>
     <w:p>
@@ -2517,128 +2492,20 @@
           <w:lang w:val="es-EC"/>
         </w:rPr>
       </w:pPr>
-      <w:proofErr w:type="spellStart"/>
       <w:r>
         <w:rPr>
           <w:rFonts w:asciiTheme="minorHAnsi" w:hAnsiTheme="minorHAnsi" w:cstheme="minorHAnsi"/>
           <w:b/>
           <w:lang w:val="es-EC"/>
         </w:rPr>
-        <w:t>Massively</w:t>
-      </w:r>
-      <w:proofErr w:type="spellEnd"/>
-      <w:r>
-        <w:rPr>
-          <w:rFonts w:asciiTheme="minorHAnsi" w:hAnsiTheme="minorHAnsi" w:cstheme="minorHAnsi"/>
-          <w:b/>
-          <w:lang w:val="es-EC"/>
-        </w:rPr>
-        <w:t>:</w:t>
-      </w:r>
-      <w:r>
-        <w:rPr>
-          <w:rFonts w:asciiTheme="minorHAnsi" w:hAnsiTheme="minorHAnsi" w:cstheme="minorHAnsi"/>
-          <w:lang w:val="es-EC"/>
-        </w:rPr>
-        <w:t xml:space="preserve"> </w:t>
-      </w:r>
-      <w:r>
-        <w:rPr>
-          <w:rFonts w:asciiTheme="minorHAnsi" w:hAnsiTheme="minorHAnsi" w:cstheme="minorHAnsi"/>
-          <w:lang w:val="es-EC"/>
-        </w:rPr>
-        <w:t>Se ve como una plantilla e</w:t>
-      </w:r>
-      <w:r>
-        <w:rPr>
-          <w:rFonts w:asciiTheme="minorHAnsi" w:hAnsiTheme="minorHAnsi" w:cstheme="minorHAnsi"/>
-          <w:lang w:val="es-EC"/>
-        </w:rPr>
-        <w:t xml:space="preserve">nfocada </w:t>
-      </w:r>
-      <w:r>
-        <w:rPr>
-          <w:rFonts w:asciiTheme="minorHAnsi" w:hAnsiTheme="minorHAnsi" w:cstheme="minorHAnsi"/>
-          <w:lang w:val="es-EC"/>
-        </w:rPr>
-        <w:t>en la narración de algún evento</w:t>
-      </w:r>
-      <w:r>
-        <w:rPr>
-          <w:rFonts w:asciiTheme="minorHAnsi" w:hAnsiTheme="minorHAnsi" w:cstheme="minorHAnsi"/>
-          <w:lang w:val="es-EC"/>
-        </w:rPr>
-        <w:t xml:space="preserve"> y</w:t>
-      </w:r>
-      <w:r>
-        <w:rPr>
-          <w:rFonts w:asciiTheme="minorHAnsi" w:hAnsiTheme="minorHAnsi" w:cstheme="minorHAnsi"/>
-          <w:lang w:val="es-EC"/>
-        </w:rPr>
-        <w:t xml:space="preserve"> de</w:t>
-      </w:r>
-      <w:r>
-        <w:rPr>
-          <w:rFonts w:asciiTheme="minorHAnsi" w:hAnsiTheme="minorHAnsi" w:cstheme="minorHAnsi"/>
-          <w:lang w:val="es-EC"/>
-        </w:rPr>
-        <w:t xml:space="preserve"> artículos largos, con un</w:t>
-      </w:r>
-      <w:r>
-        <w:rPr>
-          <w:rFonts w:asciiTheme="minorHAnsi" w:hAnsiTheme="minorHAnsi" w:cstheme="minorHAnsi"/>
-          <w:lang w:val="es-EC"/>
-        </w:rPr>
-        <w:t>a gran imagen en la cabecera</w:t>
-      </w:r>
-      <w:r>
-        <w:rPr>
-          <w:rFonts w:asciiTheme="minorHAnsi" w:hAnsiTheme="minorHAnsi" w:cstheme="minorHAnsi"/>
-          <w:lang w:val="es-EC"/>
-        </w:rPr>
-        <w:t>, lis</w:t>
-      </w:r>
-      <w:r>
-        <w:rPr>
-          <w:rFonts w:asciiTheme="minorHAnsi" w:hAnsiTheme="minorHAnsi" w:cstheme="minorHAnsi"/>
-          <w:lang w:val="es-EC"/>
-        </w:rPr>
-        <w:t>tados de publicaciones destacada</w:t>
-      </w:r>
-      <w:r>
-        <w:rPr>
-          <w:rFonts w:asciiTheme="minorHAnsi" w:hAnsiTheme="minorHAnsi" w:cstheme="minorHAnsi"/>
-          <w:lang w:val="es-EC"/>
-        </w:rPr>
-        <w:t>s</w:t>
-      </w:r>
-      <w:r>
-        <w:rPr>
-          <w:rFonts w:asciiTheme="minorHAnsi" w:hAnsiTheme="minorHAnsi" w:cstheme="minorHAnsi"/>
-          <w:lang w:val="es-EC"/>
-        </w:rPr>
-        <w:t xml:space="preserve"> con imágenes</w:t>
-      </w:r>
-      <w:r>
-        <w:rPr>
-          <w:rFonts w:asciiTheme="minorHAnsi" w:hAnsiTheme="minorHAnsi" w:cstheme="minorHAnsi"/>
-          <w:lang w:val="es-EC"/>
-        </w:rPr>
-        <w:t xml:space="preserve"> y un diseño</w:t>
-      </w:r>
-      <w:r>
-        <w:rPr>
-          <w:rFonts w:asciiTheme="minorHAnsi" w:hAnsiTheme="minorHAnsi" w:cstheme="minorHAnsi"/>
-          <w:lang w:val="es-EC"/>
-        </w:rPr>
-        <w:t xml:space="preserve"> tipo editorial muy pulido</w:t>
-      </w:r>
-      <w:r>
-        <w:rPr>
-          <w:rFonts w:asciiTheme="minorHAnsi" w:hAnsiTheme="minorHAnsi" w:cstheme="minorHAnsi"/>
-          <w:lang w:val="es-EC"/>
-        </w:rPr>
-        <w:t>.</w:t>
+        <w:t>Massively:</w:t>
+      </w:r>
+      <w:r>
+        <w:rPr>
+          <w:rFonts w:asciiTheme="minorHAnsi" w:hAnsiTheme="minorHAnsi" w:cstheme="minorHAnsi"/>
+          <w:lang w:val="es-EC"/>
+        </w:rPr>
+        <w:t xml:space="preserve"> Se ve como una plantilla enfocada en la narración de algún evento y de artículos largos, con una gran imagen en la cabecera, listados de publicaciones destacadas con imágenes y un diseño tipo editorial muy pulido.</w:t>
       </w:r>
     </w:p>
     <w:p>
@@ -2654,28 +2521,19 @@
           <w:lang w:val="es-EC"/>
         </w:rPr>
       </w:pPr>
-      <w:proofErr w:type="spellStart"/>
       <w:r>
         <w:rPr>
           <w:rFonts w:asciiTheme="minorHAnsi" w:hAnsiTheme="minorHAnsi" w:cstheme="minorHAnsi"/>
           <w:b/>
           <w:bCs/>
         </w:rPr>
-        <w:t>Spectral</w:t>
-      </w:r>
-      <w:proofErr w:type="spellEnd"/>
+        <w:lastRenderedPageBreak/>
+        <w:t>Spectral:</w:t>
+      </w:r>
       <w:r>
         <w:rPr>
           <w:rFonts w:asciiTheme="minorHAnsi" w:hAnsiTheme="minorHAnsi" w:cstheme="minorHAnsi"/>
           <w:b/>
-          <w:bCs/>
-        </w:rPr>
-        <w:t>:</w:t>
-      </w:r>
-      <w:r>
-        <w:rPr>
-          <w:rFonts w:asciiTheme="minorHAnsi" w:hAnsiTheme="minorHAnsi" w:cstheme="minorHAnsi"/>
-          <w:b/>
         </w:rPr>
         <w:t xml:space="preserve"> </w:t>
       </w:r>
@@ -2684,39 +2542,7 @@
           <w:rFonts w:asciiTheme="minorHAnsi" w:hAnsiTheme="minorHAnsi" w:cstheme="minorHAnsi"/>
           <w:lang w:val="es-EC"/>
         </w:rPr>
-        <w:t>Es una plantilla moderna y dinámica construida a base de secciones verticales a pantalla completa (full-</w:t>
-      </w:r>
-      <w:proofErr w:type="spellStart"/>
-      <w:r>
-        <w:rPr>
-          <w:rFonts w:asciiTheme="minorHAnsi" w:hAnsiTheme="minorHAnsi" w:cstheme="minorHAnsi"/>
-          <w:lang w:val="es-EC"/>
-        </w:rPr>
-        <w:t>width</w:t>
-      </w:r>
-      <w:proofErr w:type="spellEnd"/>
-      <w:r>
-        <w:rPr>
-          <w:rFonts w:asciiTheme="minorHAnsi" w:hAnsiTheme="minorHAnsi" w:cstheme="minorHAnsi"/>
-          <w:lang w:val="es-EC"/>
-        </w:rPr>
-        <w:t>), caracterizada por fondos con degradados, alto contraste visual y un menú lateral deslizable (</w:t>
-      </w:r>
-      <w:proofErr w:type="spellStart"/>
-      <w:r>
-        <w:rPr>
-          <w:rFonts w:asciiTheme="minorHAnsi" w:hAnsiTheme="minorHAnsi" w:cstheme="minorHAnsi"/>
-          <w:lang w:val="es-EC"/>
-        </w:rPr>
-        <w:t>slide-out</w:t>
-      </w:r>
-      <w:proofErr w:type="spellEnd"/>
-      <w:r>
-        <w:rPr>
-          <w:rFonts w:asciiTheme="minorHAnsi" w:hAnsiTheme="minorHAnsi" w:cstheme="minorHAnsi"/>
-          <w:lang w:val="es-EC"/>
-        </w:rPr>
-        <w:t>).</w:t>
+        <w:t>Es una plantilla moderna y dinámica construida a base de secciones verticales a pantalla completa (full-width), caracterizada por fondos con degradados, alto contraste visual y un menú lateral deslizable (slide-out).</w:t>
       </w:r>
     </w:p>
     <w:p>
@@ -2746,34 +2572,14 @@
         </w:rPr>
         <w:t xml:space="preserve"> Es una plantilla sobria y corporativa de diseño limpio, con una barra de navegación superior fija (</w:t>
       </w:r>
-      <w:proofErr w:type="spellStart"/>
       <w:r>
         <w:rPr>
           <w:rFonts w:asciiTheme="minorHAnsi" w:hAnsiTheme="minorHAnsi" w:cstheme="minorHAnsi"/>
           <w:i/>
           <w:iCs/>
         </w:rPr>
-        <w:t>sticky</w:t>
-      </w:r>
-      <w:proofErr w:type="spellEnd"/>
-      <w:r>
-        <w:rPr>
-          <w:rFonts w:asciiTheme="minorHAnsi" w:hAnsiTheme="minorHAnsi" w:cstheme="minorHAnsi"/>
-          <w:i/>
-          <w:iCs/>
-        </w:rPr>
-        <w:t xml:space="preserve"> </w:t>
-      </w:r>
-      <w:proofErr w:type="spellStart"/>
-      <w:r>
-        <w:rPr>
-          <w:rFonts w:asciiTheme="minorHAnsi" w:hAnsiTheme="minorHAnsi" w:cstheme="minorHAnsi"/>
-          <w:i/>
-          <w:iCs/>
-        </w:rPr>
-        <w:t>navbar</w:t>
-      </w:r>
-      <w:proofErr w:type="spellEnd"/>
+        <w:t>sticky navbar</w:t>
+      </w:r>
       <w:r>
         <w:rPr>
           <w:rFonts w:asciiTheme="minorHAnsi" w:hAnsiTheme="minorHAnsi" w:cstheme="minorHAnsi"/>
@@ -2840,14 +2646,12 @@
                 <w:lang w:val="es-EC"/>
               </w:rPr>
             </w:pPr>
-            <w:proofErr w:type="spellStart"/>
             <w:r>
               <w:rPr>
                 <w:lang w:val="es-EC"/>
               </w:rPr>
               <w:t>Massively</w:t>
             </w:r>
-            <w:proofErr w:type="spellEnd"/>
           </w:p>
         </w:tc>
         <w:tc>
@@ -2862,14 +2666,12 @@
                 <w:lang w:val="es-EC"/>
               </w:rPr>
             </w:pPr>
-            <w:proofErr w:type="spellStart"/>
             <w:r>
               <w:rPr>
                 <w:lang w:val="es-EC"/>
               </w:rPr>
               <w:t>Spectral</w:t>
             </w:r>
-            <w:proofErr w:type="spellEnd"/>
           </w:p>
         </w:tc>
         <w:tc>
@@ -2929,26 +2731,7 @@
               <w:rPr>
                 <w:lang w:val="es-EC"/>
               </w:rPr>
-              <w:t xml:space="preserve">Diseñada para artículos y blogs, destacando entradas </w:t>
-            </w:r>
-            <w:r>
-              <w:rPr>
-                <w:lang w:val="es-EC"/>
-              </w:rPr>
-              <w:lastRenderedPageBreak/>
-              <w:t>principales, ex</w:t>
-            </w:r>
-            <w:r>
-              <w:rPr>
-                <w:lang w:val="es-EC"/>
-              </w:rPr>
-              <w:t>tractos y una sección central para una</w:t>
-            </w:r>
-            <w:r>
-              <w:rPr>
-                <w:lang w:val="es-EC"/>
-              </w:rPr>
-              <w:t xml:space="preserve"> lectura fluida.</w:t>
+              <w:t>Diseñada para artículos y blogs, destacando entradas principales, extractos y una sección central para una lectura fluida.</w:t>
             </w:r>
           </w:p>
         </w:tc>
@@ -2963,7 +2746,6 @@
               </w:rPr>
             </w:pPr>
             <w:r>
-              <w:lastRenderedPageBreak/>
               <w:t>Bloques verticales a pantalla completa (</w:t>
             </w:r>
             <w:r>
@@ -2971,23 +2753,10 @@
                 <w:i/>
                 <w:iCs/>
               </w:rPr>
-              <w:t>full-</w:t>
-            </w:r>
-            <w:proofErr w:type="spellStart"/>
-            <w:r>
-              <w:rPr>
-                <w:i/>
-                <w:iCs/>
-              </w:rPr>
-              <w:t>width</w:t>
-            </w:r>
-            <w:proofErr w:type="spellEnd"/>
-            <w:r>
-              <w:t xml:space="preserve">) alternados con </w:t>
+              <w:t>full-width</w:t>
             </w:r>
             <w:r>
-              <w:lastRenderedPageBreak/>
-              <w:t>alto contraste visual y transiciones dinámicas.</w:t>
+              <w:t>) alternados con alto contraste visual y transiciones dinámicas.</w:t>
             </w:r>
           </w:p>
         </w:tc>
@@ -3002,12 +2771,7 @@
               </w:rPr>
             </w:pPr>
             <w:r>
-              <w:lastRenderedPageBreak/>
-              <w:t xml:space="preserve">Estructura tradicional y sobria basada en </w:t>
-            </w:r>
-            <w:r>
-              <w:lastRenderedPageBreak/>
-              <w:t>contenedores limpios y tarjetas simétricas.</w:t>
+              <w:t>Estructura tradicional y sobria basada en contenedores limpios y tarjetas simétricas.</w:t>
             </w:r>
           </w:p>
         </w:tc>
@@ -3029,7 +2793,6 @@
               <w:rPr>
                 <w:lang w:val="es-EC"/>
               </w:rPr>
-              <w:lastRenderedPageBreak/>
               <w:t>Navegación</w:t>
             </w:r>
           </w:p>
@@ -3049,25 +2812,7 @@
               <w:rPr>
                 <w:lang w:val="es-EC"/>
               </w:rPr>
-              <w:t>Tiene un m</w:t>
-            </w:r>
-            <w:r>
-              <w:rPr>
-                <w:lang w:val="es-EC"/>
-              </w:rPr>
-              <w:t>enú superior/lateral limpio, centrad</w:t>
-            </w:r>
-            <w:r>
-              <w:rPr>
-                <w:lang w:val="es-EC"/>
-              </w:rPr>
-              <w:t>o en guiar al lector a través del tema</w:t>
-            </w:r>
-            <w:r>
-              <w:rPr>
-                <w:lang w:val="es-EC"/>
-              </w:rPr>
-              <w:t>.</w:t>
+              <w:t>Tiene un menú superior/lateral limpio, centrado en guiar al lector a través del tema.</w:t>
             </w:r>
           </w:p>
         </w:tc>
@@ -3084,31 +2829,13 @@
             <w:r>
               <w:t>Menú lateral oculto tipo hamburguesa (</w:t>
             </w:r>
-            <w:proofErr w:type="spellStart"/>
             <w:r>
               <w:rPr>
                 <w:i/>
                 <w:iCs/>
               </w:rPr>
-              <w:t>slide-out</w:t>
+              <w:t>slide-out menu</w:t>
             </w:r>
-            <w:proofErr w:type="spellEnd"/>
-            <w:r>
-              <w:rPr>
-                <w:i/>
-                <w:iCs/>
-              </w:rPr>
-              <w:t xml:space="preserve"> </w:t>
-            </w:r>
-            <w:proofErr w:type="spellStart"/>
-            <w:r>
-              <w:rPr>
-                <w:i/>
-                <w:iCs/>
-              </w:rPr>
-              <w:t>menu</w:t>
-            </w:r>
-            <w:proofErr w:type="spellEnd"/>
             <w:r>
               <w:t>) desplegable desde la derecha.</w:t>
             </w:r>
@@ -3127,31 +2854,13 @@
             <w:r>
               <w:t>Barra de navegación superior fija (</w:t>
             </w:r>
-            <w:proofErr w:type="spellStart"/>
             <w:r>
               <w:rPr>
                 <w:i/>
                 <w:iCs/>
               </w:rPr>
-              <w:t>sticky</w:t>
+              <w:t>sticky navbar</w:t>
             </w:r>
-            <w:proofErr w:type="spellEnd"/>
-            <w:r>
-              <w:rPr>
-                <w:i/>
-                <w:iCs/>
-              </w:rPr>
-              <w:t xml:space="preserve"> </w:t>
-            </w:r>
-            <w:proofErr w:type="spellStart"/>
-            <w:r>
-              <w:rPr>
-                <w:i/>
-                <w:iCs/>
-              </w:rPr>
-              <w:t>navbar</w:t>
-            </w:r>
-            <w:proofErr w:type="spellEnd"/>
             <w:r>
               <w:t>) con soporte para listas y submenús desplegables.</w:t>
             </w:r>
@@ -3265,25 +2974,7 @@
               <w:rPr>
                 <w:lang w:val="es-EC"/>
               </w:rPr>
-              <w:t>Muy adap</w:t>
-            </w:r>
-            <w:r>
-              <w:rPr>
-                <w:lang w:val="es-EC"/>
-              </w:rPr>
-              <w:t>table,</w:t>
-            </w:r>
-            <w:r>
-              <w:rPr>
-                <w:lang w:val="es-EC"/>
-              </w:rPr>
-              <w:t xml:space="preserve"> redimensiona las imágenes y reorganiza las tarjetas de contenido de manera fluida</w:t>
-            </w:r>
-            <w:r>
-              <w:rPr>
-                <w:lang w:val="es-EC"/>
-              </w:rPr>
-              <w:t>, ideal para módulo móvil.</w:t>
+              <w:t>Muy adaptable, redimensiona las imágenes y reorganiza las tarjetas de contenido de manera fluida, ideal para módulo móvil.</w:t>
             </w:r>
           </w:p>
         </w:tc>
@@ -3354,25 +3045,7 @@
               <w:rPr>
                 <w:lang w:val="es-EC"/>
               </w:rPr>
-              <w:t>Es e</w:t>
-            </w:r>
-            <w:r>
-              <w:rPr>
-                <w:lang w:val="es-EC"/>
-              </w:rPr>
-              <w:t xml:space="preserve">xcelente para integrar galerías y bloques de texto, aunque su estructura está muy orientada a </w:t>
-            </w:r>
-            <w:r>
-              <w:rPr>
-                <w:lang w:val="es-EC"/>
-              </w:rPr>
-              <w:t xml:space="preserve">un </w:t>
-            </w:r>
-            <w:r>
-              <w:rPr>
-                <w:lang w:val="es-EC"/>
-              </w:rPr>
-              <w:t>formato de blog.</w:t>
+              <w:t>Es excelente para integrar galerías y bloques de texto, aunque su estructura está muy orientada a un formato de blog.</w:t>
             </w:r>
           </w:p>
         </w:tc>
@@ -3426,21 +3099,7 @@
         <w:rPr>
           <w:lang w:val="es-EC"/>
         </w:rPr>
-        <w:t xml:space="preserve">En base a la comparación realizada, se decidió utilizar la plantilla de </w:t>
-      </w:r>
-      <w:proofErr w:type="spellStart"/>
-      <w:r>
-        <w:rPr>
-          <w:lang w:val="es-EC"/>
-        </w:rPr>
-        <w:t>Massively</w:t>
-      </w:r>
-      <w:proofErr w:type="spellEnd"/>
-      <w:r>
-        <w:rPr>
-          <w:lang w:val="es-EC"/>
-        </w:rPr>
-        <w:t>, por los siguientes factores:</w:t>
+        <w:t>En base a la comparación realizada, se decidió utilizar la plantilla de Massively, por los siguientes factores:</w:t>
       </w:r>
     </w:p>
     <w:p>
@@ -3461,23 +3120,15 @@
           <w:rFonts w:asciiTheme="minorHAnsi" w:hAnsiTheme="minorHAnsi" w:cstheme="minorHAnsi"/>
           <w:lang w:val="es-EC"/>
         </w:rPr>
-        <w:t xml:space="preserve">Esta plantilla se enfoca en el </w:t>
-      </w:r>
-      <w:proofErr w:type="spellStart"/>
-      <w:r>
-        <w:rPr>
-          <w:rFonts w:asciiTheme="minorHAnsi" w:hAnsiTheme="minorHAnsi" w:cstheme="minorHAnsi"/>
-          <w:lang w:val="es-EC"/>
-        </w:rPr>
-        <w:t>storytelling</w:t>
-      </w:r>
-      <w:proofErr w:type="spellEnd"/>
-      <w:r>
-        <w:rPr>
-          <w:rFonts w:asciiTheme="minorHAnsi" w:hAnsiTheme="minorHAnsi" w:cstheme="minorHAnsi"/>
-          <w:lang w:val="es-EC"/>
-        </w:rPr>
-        <w:t>, por lo tanto es ideal para presentar los datos de las entrevistas de forma ordenada y legible mientras se cuenta una historia que en este caso es sobre los juegos tradicionales.</w:t>
+        <w:t xml:space="preserve">Esta plantilla se enfoca en el storytelling, por lo tanto es ideal para presentar los datos de </w:t>
+      </w:r>
+      <w:r>
+        <w:rPr>
+          <w:rFonts w:asciiTheme="minorHAnsi" w:hAnsiTheme="minorHAnsi" w:cstheme="minorHAnsi"/>
+          <w:lang w:val="es-EC"/>
+        </w:rPr>
+        <w:lastRenderedPageBreak/>
+        <w:t>las entrevistas de forma ordenada y legible mientras se cuenta una historia que en este caso es sobre los juegos tradicionales.</w:t>
       </w:r>
     </w:p>
     <w:p>
@@ -3540,6 +3191,7 @@
     </w:p>
     <w:p>
       <w:pPr>
+        <w:keepNext/>
         <w:jc w:val="both"/>
         <w:rPr>
           <w:rFonts w:cstheme="minorHAnsi"/>
@@ -3559,55 +3211,7 @@
           <w:szCs w:val="28"/>
           <w:lang w:val="es-EC"/>
         </w:rPr>
-        <w:t>1. Arquitectura de Información y Mapa del Sitio (</w:t>
-      </w:r>
-      <w:proofErr w:type="spellStart"/>
-      <w:r>
-        <w:rPr>
-          <w:rFonts w:cstheme="minorHAnsi"/>
-          <w:b/>
-          <w:bCs/>
-          <w:sz w:val="28"/>
-          <w:szCs w:val="28"/>
-          <w:lang w:val="es-EC"/>
-        </w:rPr>
-        <w:t>Wireframe</w:t>
-      </w:r>
-      <w:proofErr w:type="spellEnd"/>
-      <w:r>
-        <w:rPr>
-          <w:rFonts w:cstheme="minorHAnsi"/>
-          <w:b/>
-          <w:bCs/>
-          <w:sz w:val="28"/>
-          <w:szCs w:val="28"/>
-          <w:lang w:val="es-EC"/>
-        </w:rPr>
-        <w:t xml:space="preserve"> / </w:t>
-      </w:r>
-      <w:proofErr w:type="spellStart"/>
-      <w:r>
-        <w:rPr>
-          <w:rFonts w:cstheme="minorHAnsi"/>
-          <w:b/>
-          <w:bCs/>
-          <w:sz w:val="28"/>
-          <w:szCs w:val="28"/>
-          <w:lang w:val="es-EC"/>
-        </w:rPr>
-        <w:t>Layout</w:t>
-      </w:r>
-      <w:proofErr w:type="spellEnd"/>
-      <w:r>
-        <w:rPr>
-          <w:rFonts w:cstheme="minorHAnsi"/>
-          <w:b/>
-          <w:bCs/>
-          <w:sz w:val="28"/>
-          <w:szCs w:val="28"/>
-          <w:lang w:val="es-EC"/>
-        </w:rPr>
-        <w:t>)</w:t>
+        <w:t>1. Arquitectura de Información y Mapa del Sitio (Wireframe / Layout)</w:t>
       </w:r>
     </w:p>
     <w:p>
@@ -3624,55 +3228,7 @@
           <w:rFonts w:eastAsia="Arial" w:cstheme="minorHAnsi"/>
           <w:lang w:val="es-EC"/>
         </w:rPr>
-        <w:t xml:space="preserve">Sobre la estructura base de </w:t>
-      </w:r>
-      <w:proofErr w:type="spellStart"/>
-      <w:r>
-        <w:rPr>
-          <w:rFonts w:eastAsia="Arial" w:cstheme="minorHAnsi"/>
-          <w:lang w:val="es-EC"/>
-        </w:rPr>
-        <w:t>Massively</w:t>
-      </w:r>
-      <w:proofErr w:type="spellEnd"/>
-      <w:r>
-        <w:rPr>
-          <w:rFonts w:eastAsia="Arial" w:cstheme="minorHAnsi"/>
-          <w:lang w:val="es-EC"/>
-        </w:rPr>
-        <w:t>, se organizó el flujo visual en un esquema vertical (</w:t>
-      </w:r>
-      <w:proofErr w:type="spellStart"/>
-      <w:r>
-        <w:rPr>
-          <w:rFonts w:eastAsia="Arial" w:cstheme="minorHAnsi"/>
-          <w:lang w:val="es-EC"/>
-        </w:rPr>
-        <w:t>one</w:t>
-      </w:r>
-      <w:proofErr w:type="spellEnd"/>
-      <w:r>
-        <w:rPr>
-          <w:rFonts w:eastAsia="Arial" w:cstheme="minorHAnsi"/>
-          <w:lang w:val="es-EC"/>
-        </w:rPr>
-        <w:t xml:space="preserve">-page </w:t>
-      </w:r>
-      <w:proofErr w:type="spellStart"/>
-      <w:r>
-        <w:rPr>
-          <w:rFonts w:eastAsia="Arial" w:cstheme="minorHAnsi"/>
-          <w:lang w:val="es-EC"/>
-        </w:rPr>
-        <w:t>storytelling</w:t>
-      </w:r>
-      <w:proofErr w:type="spellEnd"/>
-      <w:r>
-        <w:rPr>
-          <w:rFonts w:eastAsia="Arial" w:cstheme="minorHAnsi"/>
-          <w:lang w:val="es-EC"/>
-        </w:rPr>
-        <w:t>) dividido en los siguientes bloques:</w:t>
+        <w:t>Sobre la estructura base de Massively, se organizó el flujo visual en un esquema vertical (one-page storytelling) dividido en los siguientes bloques:</w:t>
       </w:r>
     </w:p>
     <w:p>
@@ -3688,22 +3244,28 @@
           <w:lang w:val="es-EC"/>
         </w:rPr>
       </w:pPr>
-      <w:proofErr w:type="spellStart"/>
       <w:r>
         <w:rPr>
           <w:rFonts w:eastAsia="Arial" w:cstheme="minorHAnsi"/>
-          <w:lang w:val="es-EC"/>
-        </w:rPr>
-        <w:lastRenderedPageBreak/>
-        <w:t>Intro</w:t>
-      </w:r>
-      <w:proofErr w:type="spellEnd"/>
+          <w:b/>
+          <w:bCs/>
+          <w:lang w:val="es-EC"/>
+        </w:rPr>
+        <w:t xml:space="preserve">Intro / Cabecera (Hero Banner): </w:t>
+      </w:r>
       <w:r>
         <w:rPr>
           <w:rFonts w:eastAsia="Arial" w:cstheme="minorHAnsi"/>
           <w:lang w:val="es-EC"/>
         </w:rPr>
-        <w:t xml:space="preserve"> / Cabecera (Hero Banner): Imagen panorámica de fondo del sector de la Gallegos Lara, título del proyecto (“Tradiciones y niñez en la comunidad”) y botón de desplazamiento hacia el contenido.</w:t>
+        <w:t>fotografía del público reunido alrededor del torneo nocturno en la Gallego</w:t>
+      </w:r>
+      <w:r>
+        <w:rPr>
+          <w:rFonts w:eastAsia="Arial" w:cstheme="minorHAnsi"/>
+          <w:lang w:val="es-EC"/>
+        </w:rPr>
+        <w:t>s Lara como fondo, título del proyecto (“Tradiciones y Niñez en la Comunidad”) y botón para desplazarse al contenido.</w:t>
       </w:r>
     </w:p>
     <w:p>
@@ -3722,41 +3284,25 @@
       <w:r>
         <w:rPr>
           <w:rFonts w:eastAsia="Arial" w:cstheme="minorHAnsi"/>
-          <w:lang w:val="es-EC"/>
-        </w:rPr>
-        <w:t>Sección Destacada (</w:t>
-      </w:r>
-      <w:proofErr w:type="spellStart"/>
+          <w:b/>
+          <w:bCs/>
+          <w:lang w:val="es-EC"/>
+        </w:rPr>
+        <w:t xml:space="preserve">Sección Destacada (Featured Post): </w:t>
+      </w:r>
       <w:r>
         <w:rPr>
           <w:rFonts w:eastAsia="Arial" w:cstheme="minorHAnsi"/>
           <w:lang w:val="es-EC"/>
         </w:rPr>
-        <w:t>Featured</w:t>
-      </w:r>
-      <w:proofErr w:type="spellEnd"/>
+        <w:t>bloque principal con el contexto de la actividad durante las fiestas octubrinas, acompañado de la fotog</w:t>
+      </w:r>
       <w:r>
         <w:rPr>
           <w:rFonts w:eastAsia="Arial" w:cstheme="minorHAnsi"/>
           <w:lang w:val="es-EC"/>
         </w:rPr>
-        <w:t xml:space="preserve"> Post): Bloque principal que expone el contexto de la actividad, la importancia de las fiestas </w:t>
-      </w:r>
-      <w:proofErr w:type="spellStart"/>
-      <w:r>
-        <w:rPr>
-          <w:rFonts w:eastAsia="Arial" w:cstheme="minorHAnsi"/>
-          <w:lang w:val="es-EC"/>
-        </w:rPr>
-        <w:t>octubrinas</w:t>
-      </w:r>
-      <w:proofErr w:type="spellEnd"/>
-      <w:r>
-        <w:rPr>
-          <w:rFonts w:eastAsia="Arial" w:cstheme="minorHAnsi"/>
-          <w:lang w:val="es-EC"/>
-        </w:rPr>
-        <w:t xml:space="preserve"> y el valor de rescatar la memoria histórica lúdica en Guayaquil.</w:t>
+        <w:t>rafía del partido jugado bajo la lluvia.</w:t>
       </w:r>
     </w:p>
     <w:p>
@@ -3775,41 +3321,18 @@
       <w:r>
         <w:rPr>
           <w:rFonts w:eastAsia="Arial" w:cstheme="minorHAnsi"/>
-          <w:lang w:val="es-EC"/>
-        </w:rPr>
-        <w:t xml:space="preserve">Rejilla de Contenidos (Content </w:t>
-      </w:r>
-      <w:proofErr w:type="spellStart"/>
+          <w:b/>
+          <w:bCs/>
+          <w:lang w:val="es-EC"/>
+        </w:rPr>
+        <w:t xml:space="preserve">Rejilla de Contenidos (Content Grid): </w:t>
+      </w:r>
       <w:r>
         <w:rPr>
           <w:rFonts w:eastAsia="Arial" w:cstheme="minorHAnsi"/>
           <w:lang w:val="es-EC"/>
         </w:rPr>
-        <w:t>Grid</w:t>
-      </w:r>
-      <w:proofErr w:type="spellEnd"/>
-      <w:r>
-        <w:rPr>
-          <w:rFonts w:eastAsia="Arial" w:cstheme="minorHAnsi"/>
-          <w:lang w:val="es-EC"/>
-        </w:rPr>
-        <w:t>): Disposición en tarjetas (</w:t>
-      </w:r>
-      <w:proofErr w:type="spellStart"/>
-      <w:r>
-        <w:rPr>
-          <w:rFonts w:eastAsia="Arial" w:cstheme="minorHAnsi"/>
-          <w:lang w:val="es-EC"/>
-        </w:rPr>
-        <w:t>cards</w:t>
-      </w:r>
-      <w:proofErr w:type="spellEnd"/>
-      <w:r>
-        <w:rPr>
-          <w:rFonts w:eastAsia="Arial" w:cstheme="minorHAnsi"/>
-          <w:lang w:val="es-EC"/>
-        </w:rPr>
-        <w:t>) modulares para:</w:t>
+        <w:t>tarjetas modulares, cada una con una fotografía del evento:</w:t>
       </w:r>
     </w:p>
     <w:p>
@@ -3828,9 +3351,25 @@
       <w:r>
         <w:rPr>
           <w:rFonts w:eastAsia="Arial" w:cstheme="minorHAnsi"/>
-          <w:lang w:val="es-EC"/>
-        </w:rPr>
-        <w:t>Voces de la comunidad: Testimonios contrastados de niños, jóvenes y adultos mayores.</w:t>
+          <w:b/>
+          <w:bCs/>
+          <w:lang w:val="es-EC"/>
+        </w:rPr>
+        <w:t xml:space="preserve">Voces de la comunidad: </w:t>
+      </w:r>
+      <w:r>
+        <w:rPr>
+          <w:rFonts w:eastAsia="Arial" w:cstheme="minorHAnsi"/>
+          <w:lang w:val="es-EC"/>
+        </w:rPr>
+        <w:t>testimonios contrastados de niños, jóvenes y adultos mayores, con la foto de la entrevista a u</w:t>
+      </w:r>
+      <w:r>
+        <w:rPr>
+          <w:rFonts w:eastAsia="Arial" w:cstheme="minorHAnsi"/>
+          <w:lang w:val="es-EC"/>
+        </w:rPr>
+        <w:t>n adulto mayor.</w:t>
       </w:r>
     </w:p>
     <w:p>
@@ -3849,25 +3388,18 @@
       <w:r>
         <w:rPr>
           <w:rFonts w:eastAsia="Arial" w:cstheme="minorHAnsi"/>
-          <w:lang w:val="es-EC"/>
-        </w:rPr>
-        <w:t xml:space="preserve">Comparativa de juegos: Dinámica visual entre juegos tradicionales (trompo, </w:t>
-      </w:r>
-      <w:proofErr w:type="spellStart"/>
+          <w:b/>
+          <w:bCs/>
+          <w:lang w:val="es-EC"/>
+        </w:rPr>
+        <w:t xml:space="preserve">Juegos de antes vs. de ahora: </w:t>
+      </w:r>
       <w:r>
         <w:rPr>
           <w:rFonts w:eastAsia="Arial" w:cstheme="minorHAnsi"/>
           <w:lang w:val="es-EC"/>
         </w:rPr>
-        <w:t>bolichas</w:t>
-      </w:r>
-      <w:proofErr w:type="spellEnd"/>
-      <w:r>
-        <w:rPr>
-          <w:rFonts w:eastAsia="Arial" w:cstheme="minorHAnsi"/>
-          <w:lang w:val="es-EC"/>
-        </w:rPr>
-        <w:t>, rayuela) y entretenimiento actual (celulares, videojuegos).</w:t>
+        <w:t>juegos tradicionales (trompo, bolichas, rayuela) frente al entretenimiento actual (celulares, videojuegos), con la foto del juego de la silla musical.</w:t>
       </w:r>
     </w:p>
     <w:p>
@@ -3886,9 +3418,25 @@
       <w:r>
         <w:rPr>
           <w:rFonts w:eastAsia="Arial" w:cstheme="minorHAnsi"/>
-          <w:lang w:val="es-EC"/>
-        </w:rPr>
-        <w:t>Iniciativas vecinales: Ideas de los moradores para reapropiarse del espacio público.</w:t>
+          <w:b/>
+          <w:bCs/>
+          <w:lang w:val="es-EC"/>
+        </w:rPr>
+        <w:t xml:space="preserve">Iniciativas vecinales: </w:t>
+      </w:r>
+      <w:r>
+        <w:rPr>
+          <w:rFonts w:eastAsia="Arial" w:cstheme="minorHAnsi"/>
+          <w:lang w:val="es-EC"/>
+        </w:rPr>
+        <w:t>ideas de los moradores para reapropi</w:t>
+      </w:r>
+      <w:r>
+        <w:rPr>
+          <w:rFonts w:eastAsia="Arial" w:cstheme="minorHAnsi"/>
+          <w:lang w:val="es-EC"/>
+        </w:rPr>
+        <w:t>arse del espacio público, con la foto del torneo infantil.</w:t>
       </w:r>
     </w:p>
     <w:p>
@@ -3907,9 +3455,18 @@
       <w:r>
         <w:rPr>
           <w:rFonts w:eastAsia="Arial" w:cstheme="minorHAnsi"/>
-          <w:lang w:val="es-EC"/>
-        </w:rPr>
-        <w:t>Galería Fotográfica y Registro de Campo: Rejilla multimedia con capturas del levantamiento de información y entrevistas realizadas.</w:t>
+          <w:b/>
+          <w:bCs/>
+          <w:lang w:val="es-EC"/>
+        </w:rPr>
+        <w:t xml:space="preserve">Galería del evento: </w:t>
+      </w:r>
+      <w:r>
+        <w:rPr>
+          <w:rFonts w:eastAsia="Arial" w:cstheme="minorHAnsi"/>
+          <w:lang w:val="es-EC"/>
+        </w:rPr>
+        <w:t>video principal, cuadrícula de seis fotografías y tres videos complementarios; las fotografías se amplían en un visor.</w:t>
       </w:r>
     </w:p>
     <w:p>
@@ -3928,60 +3485,217 @@
       <w:r>
         <w:rPr>
           <w:rFonts w:eastAsia="Arial" w:cstheme="minorHAnsi"/>
-          <w:lang w:val="es-EC"/>
-        </w:rPr>
-        <w:t>Pie de Página (Footer): Créditos del equipo (</w:t>
-      </w:r>
-      <w:proofErr w:type="spellStart"/>
+          <w:b/>
+          <w:bCs/>
+          <w:lang w:val="es-EC"/>
+        </w:rPr>
+        <w:t xml:space="preserve">Pie de Página (Footer): </w:t>
+      </w:r>
       <w:r>
         <w:rPr>
           <w:rFonts w:eastAsia="Arial" w:cstheme="minorHAnsi"/>
           <w:lang w:val="es-EC"/>
         </w:rPr>
-        <w:t>Mathias</w:t>
-      </w:r>
-      <w:proofErr w:type="spellEnd"/>
+        <w:t>formulario de propuestas para el b</w:t>
+      </w:r>
       <w:r>
         <w:rPr>
           <w:rFonts w:eastAsia="Arial" w:cstheme="minorHAnsi"/>
           <w:lang w:val="es-EC"/>
         </w:rPr>
-        <w:t xml:space="preserve"> </w:t>
-      </w:r>
-      <w:proofErr w:type="spellStart"/>
-      <w:r>
-        <w:rPr>
-          <w:rFonts w:eastAsia="Arial" w:cstheme="minorHAnsi"/>
-          <w:lang w:val="es-EC"/>
-        </w:rPr>
-        <w:t>Giler</w:t>
-      </w:r>
-      <w:proofErr w:type="spellEnd"/>
-      <w:r>
-        <w:rPr>
-          <w:rFonts w:eastAsia="Arial" w:cstheme="minorHAnsi"/>
-          <w:lang w:val="es-EC"/>
-        </w:rPr>
-        <w:t xml:space="preserve"> e Iván Alvarado), información de la materia y enlaces institucionales.</w:t>
-      </w:r>
-    </w:p>
-    <w:p>
-      <w:pPr>
-        <w:jc w:val="both"/>
+        <w:t>arrio, datos de la institución y la materia, integrantes del equipo y enlace al repositorio de GitHub.</w:t>
+      </w:r>
+    </w:p>
+    <w:p>
+      <w:pPr>
+        <w:keepNext/>
+        <w:spacing w:before="120" w:after="60"/>
+        <w:jc w:val="center"/>
+      </w:pPr>
+      <w:r>
+        <w:rPr>
+          <w:noProof/>
+          <w:lang w:val="es-EC" w:eastAsia="es-EC"/>
+        </w:rPr>
+        <w:lastRenderedPageBreak/>
+        <w:drawing>
+          <wp:inline distT="0" distB="0" distL="0" distR="0">
+            <wp:extent cx="5400000" cy="3375000"/>
+            <wp:effectExtent l="0" t="0" r="0" b="0"/>
+            <wp:docPr id="101" name="Figura 1" descr="Portada del sitio con la fotografía del público del torneo nocturno como fondo."/>
+            <wp:cNvGraphicFramePr>
+              <a:graphicFrameLocks xmlns:a="http://schemas.openxmlformats.org/drawingml/2006/main" noChangeAspect="1"/>
+            </wp:cNvGraphicFramePr>
+            <a:graphic xmlns:a="http://schemas.openxmlformats.org/drawingml/2006/main">
+              <a:graphicData uri="http://schemas.openxmlformats.org/drawingml/2006/picture">
+                <pic:pic xmlns:pic="http://schemas.openxmlformats.org/drawingml/2006/picture">
+                  <pic:nvPicPr>
+                    <pic:cNvPr id="101" name="figura1.jpg"/>
+                    <pic:cNvPicPr/>
+                  </pic:nvPicPr>
+                  <pic:blipFill>
+                    <a:blip r:embed="rId9"/>
+                    <a:stretch>
+                      <a:fillRect/>
+                    </a:stretch>
+                  </pic:blipFill>
+                  <pic:spPr>
+                    <a:xfrm>
+                      <a:off x="0" y="0"/>
+                      <a:ext cx="5400000" cy="3375000"/>
+                    </a:xfrm>
+                    <a:prstGeom prst="rect">
+                      <a:avLst/>
+                    </a:prstGeom>
+                    <a:ln w="6350">
+                      <a:solidFill>
+                        <a:srgbClr val="BFBFBF"/>
+                      </a:solidFill>
+                    </a:ln>
+                  </pic:spPr>
+                </pic:pic>
+              </a:graphicData>
+            </a:graphic>
+          </wp:inline>
+        </w:drawing>
+      </w:r>
+    </w:p>
+    <w:p>
+      <w:pPr>
+        <w:spacing w:after="240"/>
+        <w:jc w:val="center"/>
+      </w:pPr>
+      <w:r>
         <w:rPr>
           <w:rFonts w:cstheme="minorHAnsi"/>
           <w:b/>
           <w:bCs/>
-          <w:lang w:val="es-EC"/>
-        </w:rPr>
+          <w:i/>
+          <w:iCs/>
+          <w:color w:val="595959"/>
+          <w:sz w:val="18"/>
+          <w:szCs w:val="18"/>
+          <w:lang w:val="es-EC"/>
+        </w:rPr>
+        <w:t xml:space="preserve">Figura 1. </w:t>
+      </w:r>
+      <w:r>
+        <w:rPr>
+          <w:rFonts w:cstheme="minorHAnsi"/>
+          <w:i/>
+          <w:iCs/>
+          <w:color w:val="595959"/>
+          <w:sz w:val="18"/>
+          <w:szCs w:val="18"/>
+          <w:lang w:val="es-EC"/>
+        </w:rPr>
+        <w:t>Portada del sitio con la fotografía del público del torneo nocturno como fondo.</w:t>
+      </w:r>
+    </w:p>
+    <w:p>
+      <w:pPr>
+        <w:keepNext/>
+        <w:spacing w:before="120" w:after="60"/>
+        <w:jc w:val="center"/>
+      </w:pPr>
+      <w:r>
+        <w:rPr>
+          <w:noProof/>
+          <w:lang w:val="es-EC" w:eastAsia="es-EC"/>
+        </w:rPr>
+        <w:drawing>
+          <wp:inline distT="0" distB="0" distL="0" distR="0">
+            <wp:extent cx="4680000" cy="3586818"/>
+            <wp:effectExtent l="0" t="0" r="0" b="0"/>
+            <wp:docPr id="102" name="Figura 2" descr="Tarjetas “Voces de la Comunidad” y “Juegos de Antes vs. de Ahora” con fotografías del evento."/>
+            <wp:cNvGraphicFramePr>
+              <a:graphicFrameLocks xmlns:a="http://schemas.openxmlformats.org/drawingml/2006/main" noChangeAspect="1"/>
+            </wp:cNvGraphicFramePr>
+            <a:graphic xmlns:a="http://schemas.openxmlformats.org/drawingml/2006/main">
+              <a:graphicData uri="http://schemas.openxmlformats.org/drawingml/2006/picture">
+                <pic:pic xmlns:pic="http://schemas.openxmlformats.org/drawingml/2006/picture">
+                  <pic:nvPicPr>
+                    <pic:cNvPr id="102" name="figura2.jpg"/>
+                    <pic:cNvPicPr/>
+                  </pic:nvPicPr>
+                  <pic:blipFill>
+                    <a:blip r:embed="rId10"/>
+                    <a:stretch>
+                      <a:fillRect/>
+                    </a:stretch>
+                  </pic:blipFill>
+                  <pic:spPr>
+                    <a:xfrm>
+                      <a:off x="0" y="0"/>
+                      <a:ext cx="4680000" cy="3586818"/>
+                    </a:xfrm>
+                    <a:prstGeom prst="rect">
+                      <a:avLst/>
+                    </a:prstGeom>
+                    <a:ln w="6350">
+                      <a:solidFill>
+                        <a:srgbClr val="BFBFBF"/>
+                      </a:solidFill>
+                    </a:ln>
+                  </pic:spPr>
+                </pic:pic>
+              </a:graphicData>
+            </a:graphic>
+          </wp:inline>
+        </w:drawing>
+      </w:r>
+    </w:p>
+    <w:p>
+      <w:pPr>
+        <w:spacing w:after="240"/>
+        <w:jc w:val="center"/>
       </w:pPr>
       <w:r>
         <w:rPr>
           <w:rFonts w:cstheme="minorHAnsi"/>
           <w:b/>
           <w:bCs/>
-          <w:lang w:val="es-EC"/>
-        </w:rPr>
+          <w:i/>
+          <w:iCs/>
+          <w:color w:val="595959"/>
+          <w:sz w:val="18"/>
+          <w:szCs w:val="18"/>
+          <w:lang w:val="es-EC"/>
+        </w:rPr>
+        <w:t xml:space="preserve">Figura 2. </w:t>
+      </w:r>
+      <w:r>
+        <w:rPr>
+          <w:rFonts w:cstheme="minorHAnsi"/>
+          <w:i/>
+          <w:iCs/>
+          <w:color w:val="595959"/>
+          <w:sz w:val="18"/>
+          <w:szCs w:val="18"/>
+          <w:lang w:val="es-EC"/>
+        </w:rPr>
+        <w:t>Tarjetas “Voces de la Comunidad” y “Juegos de Antes vs. de Ahora” con fotografías del evento.</w:t>
+      </w:r>
+    </w:p>
+    <w:p>
+      <w:pPr>
+        <w:keepNext/>
+        <w:jc w:val="both"/>
+        <w:rPr>
+          <w:rFonts w:cstheme="minorHAnsi"/>
+          <w:b/>
+          <w:bCs/>
+          <w:lang w:val="es-EC"/>
+        </w:rPr>
+      </w:pPr>
+      <w:r>
+        <w:rPr>
+          <w:rFonts w:cstheme="minorHAnsi"/>
+          <w:b/>
+          <w:bCs/>
+          <w:lang w:val="es-EC"/>
+        </w:rPr>
+        <w:lastRenderedPageBreak/>
         <w:t xml:space="preserve">2. </w:t>
       </w:r>
       <w:r>
@@ -3998,6 +3712,7 @@
     </w:p>
     <w:p>
       <w:pPr>
+        <w:spacing w:after="0"/>
         <w:jc w:val="both"/>
         <w:rPr>
           <w:rFonts w:eastAsia="Arial" w:cstheme="minorHAnsi"/>
@@ -4009,23 +3724,14 @@
           <w:rFonts w:eastAsia="Arial" w:cstheme="minorHAnsi"/>
           <w:lang w:val="es-EC"/>
         </w:rPr>
-        <w:t xml:space="preserve">Para adaptar la estética original de </w:t>
-      </w:r>
-      <w:proofErr w:type="spellStart"/>
+        <w:t>Se mantuvo la identidad visual de Massively, que ya resultaba adecuada para un relato fotográfico, y se reforzó con el mater</w:t>
+      </w:r>
       <w:r>
         <w:rPr>
           <w:rFonts w:eastAsia="Arial" w:cstheme="minorHAnsi"/>
           <w:lang w:val="es-EC"/>
         </w:rPr>
-        <w:t>Massively</w:t>
-      </w:r>
-      <w:proofErr w:type="spellEnd"/>
-      <w:r>
-        <w:rPr>
-          <w:rFonts w:eastAsia="Arial" w:cstheme="minorHAnsi"/>
-          <w:lang w:val="es-EC"/>
-        </w:rPr>
-        <w:t xml:space="preserve"> al contexto cultural y comunitario del proyecto, se definieron las siguientes pautas de diseño:</w:t>
+        <w:t>ial del evento:</w:t>
       </w:r>
     </w:p>
     <w:p>
@@ -4065,25 +3771,18 @@
       <w:r>
         <w:rPr>
           <w:rFonts w:eastAsia="Arial" w:cstheme="minorHAnsi"/>
-          <w:lang w:val="es-EC"/>
-        </w:rPr>
-        <w:t xml:space="preserve">Color Primario: Tonos azulados y celestes (asociados a la identidad visual de Guayaquil y fiestas </w:t>
-      </w:r>
-      <w:proofErr w:type="spellStart"/>
+          <w:b/>
+          <w:bCs/>
+          <w:lang w:val="es-EC"/>
+        </w:rPr>
+        <w:t xml:space="preserve">Base: </w:t>
+      </w:r>
       <w:r>
         <w:rPr>
           <w:rFonts w:eastAsia="Arial" w:cstheme="minorHAnsi"/>
           <w:lang w:val="es-EC"/>
         </w:rPr>
-        <w:t>octubrinas</w:t>
-      </w:r>
-      <w:proofErr w:type="spellEnd"/>
-      <w:r>
-        <w:rPr>
-          <w:rFonts w:eastAsia="Arial" w:cstheme="minorHAnsi"/>
-          <w:lang w:val="es-EC"/>
-        </w:rPr>
-        <w:t>) aplicados a botones principales, enlaces activos y acentos visuales.</w:t>
+        <w:t>texto gris oscuro (#212931) sobre fondos blancos y grises claros, con buen contraste para leer los testimonios.</w:t>
       </w:r>
     </w:p>
     <w:p>
@@ -4102,9 +3801,18 @@
       <w:r>
         <w:rPr>
           <w:rFonts w:eastAsia="Arial" w:cstheme="minorHAnsi"/>
-          <w:lang w:val="es-EC"/>
-        </w:rPr>
-        <w:t>Color Secundario / Acentos: Tonos cálidos (dorados/ámbar) para generar contraste en etiquetas de categorías y llamados a la acción.</w:t>
+          <w:b/>
+          <w:bCs/>
+          <w:lang w:val="es-EC"/>
+        </w:rPr>
+        <w:t xml:space="preserve">Acento: </w:t>
+      </w:r>
+      <w:r>
+        <w:rPr>
+          <w:rFonts w:eastAsia="Arial" w:cstheme="minorHAnsi"/>
+          <w:lang w:val="es-EC"/>
+        </w:rPr>
+        <w:t>celeste (#18bfef) al pasar el cursor sobre los enlaces y en el botón para cerrar el visor de imágenes.</w:t>
       </w:r>
     </w:p>
     <w:p>
@@ -4123,9 +3831,25 @@
       <w:r>
         <w:rPr>
           <w:rFonts w:eastAsia="Arial" w:cstheme="minorHAnsi"/>
-          <w:lang w:val="es-EC"/>
-        </w:rPr>
-        <w:t>Fondos y Superficies: Fondos claros y neutros (grises tenues #f5f5f5 y blanco puro #ffffff) en los contenedores de lectura para maximizar el contraste y evitar fatiga visual.</w:t>
+          <w:b/>
+          <w:bCs/>
+          <w:lang w:val="es-EC"/>
+        </w:rPr>
+        <w:t xml:space="preserve">Fotografía: </w:t>
+      </w:r>
+      <w:r>
+        <w:rPr>
+          <w:rFonts w:eastAsia="Arial" w:cstheme="minorHAnsi"/>
+          <w:lang w:val="es-EC"/>
+        </w:rPr>
+        <w:t>el celeste y blanco de las cintas que decoraron la calle, propios de las fiestas octubrinas de Guayaquil, aporta la identidad del evento a la</w:t>
+      </w:r>
+      <w:r>
+        <w:rPr>
+          <w:rFonts w:eastAsia="Arial" w:cstheme="minorHAnsi"/>
+          <w:lang w:val="es-EC"/>
+        </w:rPr>
+        <w:t xml:space="preserve"> portada y a cada sección.</w:t>
       </w:r>
     </w:p>
     <w:p>
@@ -4167,59 +3891,19 @@
           <w:rFonts w:eastAsia="Arial" w:cstheme="minorHAnsi"/>
           <w:lang w:val="es-EC"/>
         </w:rPr>
-        <w:t xml:space="preserve">Se conservó la combinación de fuentes </w:t>
-      </w:r>
-      <w:proofErr w:type="spellStart"/>
-      <w:r>
-        <w:rPr>
-          <w:rFonts w:eastAsia="Arial" w:cstheme="minorHAnsi"/>
-          <w:lang w:val="es-EC"/>
-        </w:rPr>
-        <w:t>sans-serif</w:t>
-      </w:r>
-      <w:proofErr w:type="spellEnd"/>
-      <w:r>
-        <w:rPr>
-          <w:rFonts w:eastAsia="Arial" w:cstheme="minorHAnsi"/>
-          <w:lang w:val="es-EC"/>
-        </w:rPr>
-        <w:t xml:space="preserve"> nativas de la plantilla por su óptima legibilidad en pantallas: títulos principales con tipografía en mayúsculas de corte moderno y cuerpo de texto con </w:t>
-      </w:r>
-      <w:proofErr w:type="spellStart"/>
-      <w:r>
-        <w:rPr>
-          <w:rFonts w:eastAsia="Arial" w:cstheme="minorHAnsi"/>
-          <w:lang w:val="es-EC"/>
-        </w:rPr>
-        <w:t>serif</w:t>
-      </w:r>
-      <w:proofErr w:type="spellEnd"/>
-      <w:r>
-        <w:rPr>
-          <w:rFonts w:eastAsia="Arial" w:cstheme="minorHAnsi"/>
-          <w:lang w:val="es-EC"/>
-        </w:rPr>
-        <w:t>/</w:t>
-      </w:r>
-      <w:proofErr w:type="spellStart"/>
-      <w:r>
-        <w:rPr>
-          <w:rFonts w:eastAsia="Arial" w:cstheme="minorHAnsi"/>
-          <w:lang w:val="es-EC"/>
-        </w:rPr>
-        <w:t>sans-serif</w:t>
-      </w:r>
-      <w:proofErr w:type="spellEnd"/>
-      <w:r>
-        <w:rPr>
-          <w:rFonts w:eastAsia="Arial" w:cstheme="minorHAnsi"/>
-          <w:lang w:val="es-EC"/>
-        </w:rPr>
-        <w:t xml:space="preserve"> regular para una lectura cómoda de las entrevistas.</w:t>
-      </w:r>
-    </w:p>
-    <w:p>
-      <w:pPr>
+        <w:t>Se conservaron las fuentes de la plantilla: Source Sans Pro en mayúsculas para los títulos y Merriweather (con serifas) para el cuerpo del texto, que facilita la lectura de los testimonios.</w:t>
+      </w:r>
+    </w:p>
+    <w:p>
+      <w:pPr>
+        <w:rPr>
+          <w:lang w:val="es-EC"/>
+        </w:rPr>
+      </w:pPr>
+    </w:p>
+    <w:p>
+      <w:pPr>
+        <w:keepNext/>
         <w:jc w:val="both"/>
         <w:rPr>
           <w:rFonts w:cstheme="minorHAnsi"/>
@@ -4292,31 +3976,7 @@
           <w:rFonts w:asciiTheme="minorHAnsi" w:hAnsiTheme="minorHAnsi" w:cstheme="minorHAnsi"/>
           <w:lang w:val="es-EC"/>
         </w:rPr>
-        <w:t xml:space="preserve"> Se eliminaron componentes </w:t>
-      </w:r>
-      <w:r>
-        <w:rPr>
-          <w:rFonts w:asciiTheme="minorHAnsi" w:hAnsiTheme="minorHAnsi" w:cstheme="minorHAnsi"/>
-          <w:lang w:val="es-EC"/>
-        </w:rPr>
-        <w:lastRenderedPageBreak/>
-        <w:t xml:space="preserve">innecesarios (como </w:t>
-      </w:r>
-      <w:proofErr w:type="spellStart"/>
-      <w:r>
-        <w:rPr>
-          <w:rFonts w:asciiTheme="minorHAnsi" w:hAnsiTheme="minorHAnsi" w:cstheme="minorHAnsi"/>
-          <w:lang w:val="es-EC"/>
-        </w:rPr>
-        <w:t>paginadores</w:t>
-      </w:r>
-      <w:proofErr w:type="spellEnd"/>
-      <w:r>
-        <w:rPr>
-          <w:rFonts w:asciiTheme="minorHAnsi" w:hAnsiTheme="minorHAnsi" w:cstheme="minorHAnsi"/>
-          <w:lang w:val="es-EC"/>
-        </w:rPr>
-        <w:t xml:space="preserve"> de entradas múltiples o barras laterales complejas) para concentrar la experiencia en una lectura fluida.</w:t>
+        <w:t xml:space="preserve"> Se eliminaron componentes innecesarios (como paginadores de entradas múltiples o barras laterales complejas) para concentrar la experiencia en una lectura fluida.</w:t>
       </w:r>
     </w:p>
     <w:p>
@@ -4369,30 +4029,120 @@
           <w:bCs/>
           <w:lang w:val="es-EC"/>
         </w:rPr>
-        <w:t>Optimización visual responsive:</w:t>
-      </w:r>
-      <w:r>
-        <w:rPr>
-          <w:rFonts w:asciiTheme="minorHAnsi" w:hAnsiTheme="minorHAnsi" w:cstheme="minorHAnsi"/>
-          <w:lang w:val="es-EC"/>
-        </w:rPr>
-        <w:t xml:space="preserve"> Ajuste de los puntos de quiebre (media </w:t>
-      </w:r>
-      <w:proofErr w:type="spellStart"/>
-      <w:r>
-        <w:rPr>
-          <w:rFonts w:asciiTheme="minorHAnsi" w:hAnsiTheme="minorHAnsi" w:cstheme="minorHAnsi"/>
-          <w:lang w:val="es-EC"/>
-        </w:rPr>
-        <w:t>queries</w:t>
-      </w:r>
-      <w:proofErr w:type="spellEnd"/>
-      <w:r>
-        <w:rPr>
-          <w:rFonts w:asciiTheme="minorHAnsi" w:hAnsiTheme="minorHAnsi" w:cstheme="minorHAnsi"/>
-          <w:lang w:val="es-EC"/>
-        </w:rPr>
-        <w:t>) para garantizar que tanto las imágenes tomadas en la Gallegos Lara como los extractos de las entrevistas se redimensionen ordenadamente en dispositivos móviles.</w:t>
+        <w:t xml:space="preserve">Galería multimedia: </w:t>
+      </w:r>
+      <w:r>
+        <w:rPr>
+          <w:rFonts w:asciiTheme="minorHAnsi" w:hAnsiTheme="minorHAnsi" w:cstheme="minorHAnsi"/>
+          <w:lang w:val="es-EC"/>
+        </w:rPr>
+        <w:t>se adaptó la rejilla de la plantilla para combinar fotografías y videos con controles, inicio silenciado e imagen de portada.</w:t>
+      </w:r>
+    </w:p>
+    <w:p>
+      <w:pPr>
+        <w:pStyle w:val="Prrafodelista"/>
+        <w:numPr>
+          <w:ilvl w:val="0"/>
+          <w:numId w:val="17"/>
+        </w:numPr>
+        <w:jc w:val="both"/>
+        <w:rPr>
+          <w:rFonts w:asciiTheme="minorHAnsi" w:hAnsiTheme="minorHAnsi" w:cstheme="minorHAnsi"/>
+          <w:lang w:val="es-EC"/>
+        </w:rPr>
+      </w:pPr>
+      <w:r>
+        <w:rPr>
+          <w:rFonts w:asciiTheme="minorHAnsi" w:hAnsiTheme="minorHAnsi" w:cstheme="minorHAnsi"/>
+          <w:b/>
+          <w:bCs/>
+          <w:lang w:val="es-EC"/>
+        </w:rPr>
+        <w:t xml:space="preserve">Visor de imágenes: </w:t>
+      </w:r>
+      <w:r>
+        <w:rPr>
+          <w:rFonts w:asciiTheme="minorHAnsi" w:hAnsiTheme="minorHAnsi" w:cstheme="minorHAnsi"/>
+          <w:lang w:val="es-EC"/>
+        </w:rPr>
+        <w:t>al hacer clic en una fotografía se abre una vista am</w:t>
+      </w:r>
+      <w:r>
+        <w:rPr>
+          <w:rFonts w:asciiTheme="minorHAnsi" w:hAnsiTheme="minorHAnsi" w:cstheme="minorHAnsi"/>
+          <w:lang w:val="es-EC"/>
+        </w:rPr>
+        <w:t>pliada con su descripción y un botón para cerrarla, en lugar de volver al inicio de la página.</w:t>
+      </w:r>
+    </w:p>
+    <w:p>
+      <w:pPr>
+        <w:pStyle w:val="Prrafodelista"/>
+        <w:numPr>
+          <w:ilvl w:val="0"/>
+          <w:numId w:val="17"/>
+        </w:numPr>
+        <w:jc w:val="both"/>
+        <w:rPr>
+          <w:rFonts w:asciiTheme="minorHAnsi" w:hAnsiTheme="minorHAnsi" w:cstheme="minorHAnsi"/>
+          <w:lang w:val="es-EC"/>
+        </w:rPr>
+      </w:pPr>
+      <w:r>
+        <w:rPr>
+          <w:rFonts w:asciiTheme="minorHAnsi" w:hAnsiTheme="minorHAnsi" w:cstheme="minorHAnsi"/>
+          <w:b/>
+          <w:bCs/>
+          <w:lang w:val="es-EC"/>
+        </w:rPr>
+        <w:t xml:space="preserve">Navegación y redes: </w:t>
+      </w:r>
+      <w:r>
+        <w:rPr>
+          <w:rFonts w:asciiTheme="minorHAnsi" w:hAnsiTheme="minorHAnsi" w:cstheme="minorHAnsi"/>
+          <w:lang w:val="es-EC"/>
+        </w:rPr>
+        <w:t>se retiraron los botones de Facebook e Instagram, que el proyecto no utiliza, y los botones de GitHub enlazan al repositorio.</w:t>
+      </w:r>
+    </w:p>
+    <w:p>
+      <w:pPr>
+        <w:pStyle w:val="Prrafodelista"/>
+        <w:numPr>
+          <w:ilvl w:val="0"/>
+          <w:numId w:val="17"/>
+        </w:numPr>
+        <w:jc w:val="both"/>
+        <w:rPr>
+          <w:rFonts w:asciiTheme="minorHAnsi" w:hAnsiTheme="minorHAnsi" w:cstheme="minorHAnsi"/>
+          <w:lang w:val="es-EC"/>
+        </w:rPr>
+      </w:pPr>
+      <w:r>
+        <w:rPr>
+          <w:rFonts w:asciiTheme="minorHAnsi" w:hAnsiTheme="minorHAnsi" w:cstheme="minorHAnsi"/>
+          <w:b/>
+          <w:bCs/>
+          <w:lang w:val="es-EC"/>
+        </w:rPr>
+        <w:t>Diseño adaptabl</w:t>
+      </w:r>
+      <w:r>
+        <w:rPr>
+          <w:rFonts w:asciiTheme="minorHAnsi" w:hAnsiTheme="minorHAnsi" w:cstheme="minorHAnsi"/>
+          <w:b/>
+          <w:bCs/>
+          <w:lang w:val="es-EC"/>
+        </w:rPr>
+        <w:t xml:space="preserve">e: </w:t>
+      </w:r>
+      <w:r>
+        <w:rPr>
+          <w:rFonts w:asciiTheme="minorHAnsi" w:hAnsiTheme="minorHAnsi" w:cstheme="minorHAnsi"/>
+          <w:lang w:val="es-EC"/>
+        </w:rPr>
+        <w:t>se aprovecharon los puntos de quiebre de la plantilla y se comprobó que fotografías, videos y textos se reorganizan correctamente en pantallas móviles.</w:t>
       </w:r>
     </w:p>
     <w:p>
@@ -4431,27 +4181,12 @@
           <w:rFonts w:eastAsia="Arial" w:cstheme="minorHAnsi"/>
           <w:lang w:val="es-EC"/>
         </w:rPr>
-        <w:t xml:space="preserve">Para esta fase inicial, la implementación se centró en la descarga, integración y puesta en marcha del proyecto utilizando la plantilla base seleccionada, </w:t>
-      </w:r>
-      <w:proofErr w:type="spellStart"/>
-      <w:r>
-        <w:rPr>
-          <w:rFonts w:eastAsia="Arial" w:cstheme="minorHAnsi"/>
-          <w:lang w:val="es-EC"/>
-        </w:rPr>
-        <w:t>Massively</w:t>
-      </w:r>
-      <w:proofErr w:type="spellEnd"/>
-      <w:r>
-        <w:rPr>
-          <w:rFonts w:eastAsia="Arial" w:cstheme="minorHAnsi"/>
-          <w:lang w:val="es-EC"/>
-        </w:rPr>
-        <w:t xml:space="preserve"> de HTML5 UP, preservando íntegramente su arquitectura y componentes originales para verificar su correcto funcionamiento antes de proceder con la inserción del contenido definitivo.</w:t>
-      </w:r>
-    </w:p>
-    <w:p>
-      <w:pPr>
+        <w:t>La implementación partió de la plantilla Massively de HTML5 UP. Primero se montó y verificó la plantilla original; después se reemplazó su contenido de demostración por la información real del evento y se personalizó el diseño. Cada cambio se registró como un commit descriptivo en el repositorio.</w:t>
+      </w:r>
+    </w:p>
+    <w:p>
+      <w:pPr>
+        <w:keepNext/>
         <w:numPr>
           <w:ilvl w:val="0"/>
           <w:numId w:val="20"/>
@@ -4475,6 +4210,7 @@
           <w:szCs w:val="28"/>
           <w:lang w:val="es-EC"/>
         </w:rPr>
+        <w:lastRenderedPageBreak/>
         <w:t>Obtención y Preparación del Código Base:</w:t>
       </w:r>
     </w:p>
@@ -4496,23 +4232,7 @@
           <w:rFonts w:asciiTheme="minorHAnsi" w:hAnsiTheme="minorHAnsi" w:cstheme="minorHAnsi"/>
           <w:lang w:val="es-EC"/>
         </w:rPr>
-        <w:t xml:space="preserve">Se descargó el paquete oficial de la plantilla </w:t>
-      </w:r>
-      <w:proofErr w:type="spellStart"/>
-      <w:r>
-        <w:rPr>
-          <w:rFonts w:asciiTheme="minorHAnsi" w:hAnsiTheme="minorHAnsi" w:cstheme="minorHAnsi"/>
-          <w:lang w:val="es-EC"/>
-        </w:rPr>
-        <w:t>Massively</w:t>
-      </w:r>
-      <w:proofErr w:type="spellEnd"/>
-      <w:r>
-        <w:rPr>
-          <w:rFonts w:asciiTheme="minorHAnsi" w:hAnsiTheme="minorHAnsi" w:cstheme="minorHAnsi"/>
-          <w:lang w:val="es-EC"/>
-        </w:rPr>
-        <w:t xml:space="preserve"> desde el portal de HTML5 UP.</w:t>
+        <w:t>Se descargó el paquete oficial de la plantilla Massively desde el portal de HTML5 UP.</w:t>
       </w:r>
     </w:p>
     <w:p>
@@ -4533,43 +4253,12 @@
           <w:rFonts w:asciiTheme="minorHAnsi" w:hAnsiTheme="minorHAnsi" w:cstheme="minorHAnsi"/>
           <w:lang w:val="es-EC"/>
         </w:rPr>
-        <w:t xml:space="preserve">Se verificó la integridad de los recursos incluidos, los cuales comprenden el archivo de marcado semántico (index.html), las hojas de estilo CSS (diseño </w:t>
-      </w:r>
-      <w:proofErr w:type="spellStart"/>
-      <w:r>
-        <w:rPr>
-          <w:rFonts w:asciiTheme="minorHAnsi" w:hAnsiTheme="minorHAnsi" w:cstheme="minorHAnsi"/>
-          <w:lang w:val="es-EC"/>
-        </w:rPr>
-        <w:t>responsive</w:t>
-      </w:r>
-      <w:proofErr w:type="spellEnd"/>
-      <w:r>
-        <w:rPr>
-          <w:rFonts w:asciiTheme="minorHAnsi" w:hAnsiTheme="minorHAnsi" w:cstheme="minorHAnsi"/>
-          <w:lang w:val="es-EC"/>
-        </w:rPr>
-        <w:t xml:space="preserve">, </w:t>
-      </w:r>
-      <w:proofErr w:type="spellStart"/>
-      <w:r>
-        <w:rPr>
-          <w:rFonts w:asciiTheme="minorHAnsi" w:hAnsiTheme="minorHAnsi" w:cstheme="minorHAnsi"/>
-          <w:lang w:val="es-EC"/>
-        </w:rPr>
-        <w:t>reset</w:t>
-      </w:r>
-      <w:proofErr w:type="spellEnd"/>
-      <w:r>
-        <w:rPr>
-          <w:rFonts w:asciiTheme="minorHAnsi" w:hAnsiTheme="minorHAnsi" w:cstheme="minorHAnsi"/>
-          <w:lang w:val="es-EC"/>
-        </w:rPr>
-        <w:t xml:space="preserve"> y tipografías) y los scripts de soporte en JavaScript necesarios para las animaciones, menús dinámicos y compatibilidad de pantalla.</w:t>
-      </w:r>
-    </w:p>
-    <w:p>
-      <w:pPr>
+        <w:t>Se verificó la integridad de los recursos incluidos, los cuales comprenden el archivo de marcado semántico (index.html), las hojas de estilo CSS (diseño responsive, reset y tipografías) y los scripts de soporte en JavaScript necesarios para las animaciones, menús dinámicos y compatibilidad de pantalla.</w:t>
+      </w:r>
+    </w:p>
+    <w:p>
+      <w:pPr>
+        <w:keepNext/>
         <w:numPr>
           <w:ilvl w:val="0"/>
           <w:numId w:val="20"/>
@@ -4640,6 +4329,7 @@
     </w:p>
     <w:p>
       <w:pPr>
+        <w:keepNext/>
         <w:numPr>
           <w:ilvl w:val="0"/>
           <w:numId w:val="20"/>
@@ -4663,7 +4353,7 @@
           <w:szCs w:val="28"/>
           <w:lang w:val="es-EC"/>
         </w:rPr>
-        <w:t>Verificación de Componentes de la Plantilla:</w:t>
+        <w:t>Incorporación del Contenido del Evento:</w:t>
       </w:r>
     </w:p>
     <w:p>
@@ -4684,7 +4374,14 @@
           <w:rFonts w:asciiTheme="minorHAnsi" w:hAnsiTheme="minorHAnsi" w:cstheme="minorHAnsi"/>
           <w:lang w:val="es-EC"/>
         </w:rPr>
-        <w:t>Se comprobó la operatividad del sistema de navegación superior y el menú interactivo.</w:t>
+        <w:t>Se reemplazaron los textos de demostración de i</w:t>
+      </w:r>
+      <w:r>
+        <w:rPr>
+          <w:rFonts w:asciiTheme="minorHAnsi" w:hAnsiTheme="minorHAnsi" w:cstheme="minorHAnsi"/>
+          <w:lang w:val="es-EC"/>
+        </w:rPr>
+        <w:t>ndex.html por los resultados de las entrevistas, organizados en las secciones Contexto, Voces, Comparativa, Iniciativas y Galería, con enlaces de navegación hacia cada una.</w:t>
       </w:r>
     </w:p>
     <w:p>
@@ -4705,35 +4402,43 @@
           <w:rFonts w:asciiTheme="minorHAnsi" w:hAnsiTheme="minorHAnsi" w:cstheme="minorHAnsi"/>
           <w:lang w:val="es-EC"/>
         </w:rPr>
-        <w:t>Se inspeccionó el comportamiento de la c</w:t>
-      </w:r>
-      <w:r>
-        <w:rPr>
-          <w:rFonts w:asciiTheme="minorHAnsi" w:hAnsiTheme="minorHAnsi" w:cstheme="minorHAnsi"/>
-          <w:lang w:val="es-EC"/>
-        </w:rPr>
-        <w:t>abecera principal</w:t>
-      </w:r>
-      <w:r>
-        <w:rPr>
-          <w:rFonts w:asciiTheme="minorHAnsi" w:hAnsiTheme="minorHAnsi" w:cstheme="minorHAnsi"/>
-          <w:lang w:val="es-EC"/>
-        </w:rPr>
-        <w:t xml:space="preserve">, el bloque destacado y la </w:t>
-      </w:r>
-      <w:r>
-        <w:rPr>
-          <w:rFonts w:asciiTheme="minorHAnsi" w:hAnsiTheme="minorHAnsi" w:cstheme="minorHAnsi"/>
-          <w:lang w:val="es-EC"/>
-        </w:rPr>
-        <w:t>rejilla de tarjetas</w:t>
-      </w:r>
-      <w:r>
-        <w:rPr>
-          <w:rFonts w:asciiTheme="minorHAnsi" w:hAnsiTheme="minorHAnsi" w:cstheme="minorHAnsi"/>
-          <w:lang w:val="es-EC"/>
-        </w:rPr>
-        <w:t>, asegurando que los puntos de quiebre responsivos funcionen correctamente en resoluciones tanto de escritorio como de dispositivos móviles.</w:t>
+        <w:t>Se eliminaron los elementos de la plantilla que no correspondían al evento, como la</w:t>
+      </w:r>
+      <w:r>
+        <w:rPr>
+          <w:rFonts w:asciiTheme="minorHAnsi" w:hAnsiTheme="minorHAnsi" w:cstheme="minorHAnsi"/>
+          <w:lang w:val="es-EC"/>
+        </w:rPr>
+        <w:t xml:space="preserve"> paginación y las entradas genéricas de blog.</w:t>
+      </w:r>
+    </w:p>
+    <w:p>
+      <w:pPr>
+        <w:keepNext/>
+        <w:numPr>
+          <w:ilvl w:val="0"/>
+          <w:numId w:val="20"/>
+        </w:numPr>
+        <w:jc w:val="both"/>
+        <w:rPr>
+          <w:rFonts w:cstheme="minorHAnsi"/>
+          <w:b/>
+          <w:bCs/>
+          <w:sz w:val="28"/>
+          <w:szCs w:val="28"/>
+          <w:lang w:val="es-EC"/>
+        </w:rPr>
+      </w:pPr>
+      <w:r>
+        <w:rPr>
+          <w:rFonts w:cstheme="minorHAnsi"/>
+          <w:b/>
+          <w:bCs/>
+          <w:sz w:val="28"/>
+          <w:szCs w:val="28"/>
+          <w:lang w:val="es-EC"/>
+        </w:rPr>
+        <w:t>Integración de Fotografías y Videos:</w:t>
       </w:r>
     </w:p>
     <w:p>
@@ -4754,7 +4459,707 @@
           <w:rFonts w:asciiTheme="minorHAnsi" w:hAnsiTheme="minorHAnsi" w:cstheme="minorHAnsi"/>
           <w:lang w:val="es-EC"/>
         </w:rPr>
-        <w:t>Con esta verificación completada, el proyecto queda listo como lienzo base para la posterior sustitución de los textos demostrativos e imágenes por los datos recopilados en la Gallegos Lara.</w:t>
+        <w:t>Se seleccionaron 11 fotografías y 4 videos del evento y se descartaron las tomas demasiado borrosas. Las fotografías se convirtieron a JPG optimizado y se les eliminaron los</w:t>
+      </w:r>
+      <w:r>
+        <w:rPr>
+          <w:rFonts w:asciiTheme="minorHAnsi" w:hAnsiTheme="minorHAnsi" w:cstheme="minorHAnsi"/>
+          <w:lang w:val="es-EC"/>
+        </w:rPr>
+        <w:t xml:space="preserve"> metadatos.</w:t>
+      </w:r>
+    </w:p>
+    <w:p>
+      <w:pPr>
+        <w:pStyle w:val="Prrafodelista"/>
+        <w:numPr>
+          <w:ilvl w:val="0"/>
+          <w:numId w:val="22"/>
+        </w:numPr>
+        <w:jc w:val="both"/>
+        <w:rPr>
+          <w:rFonts w:asciiTheme="minorHAnsi" w:hAnsiTheme="minorHAnsi" w:cstheme="minorHAnsi"/>
+          <w:lang w:val="es-EC"/>
+        </w:rPr>
+      </w:pPr>
+      <w:r>
+        <w:rPr>
+          <w:rFonts w:asciiTheme="minorHAnsi" w:hAnsiTheme="minorHAnsi" w:cstheme="minorHAnsi"/>
+          <w:lang w:val="es-EC"/>
+        </w:rPr>
+        <w:t>El material se organizó en las carpetas images/pics e images/videos con nombres descriptivos (por ejemplo, futbol-bajo-lluvia.jpg o silla-musical.mp4).</w:t>
+      </w:r>
+    </w:p>
+    <w:p>
+      <w:pPr>
+        <w:pStyle w:val="Prrafodelista"/>
+        <w:numPr>
+          <w:ilvl w:val="0"/>
+          <w:numId w:val="22"/>
+        </w:numPr>
+        <w:jc w:val="both"/>
+        <w:rPr>
+          <w:rFonts w:asciiTheme="minorHAnsi" w:hAnsiTheme="minorHAnsi" w:cstheme="minorHAnsi"/>
+          <w:lang w:val="es-EC"/>
+        </w:rPr>
+      </w:pPr>
+      <w:r>
+        <w:rPr>
+          <w:rFonts w:asciiTheme="minorHAnsi" w:hAnsiTheme="minorHAnsi" w:cstheme="minorHAnsi"/>
+          <w:lang w:val="es-EC"/>
+        </w:rPr>
+        <w:t xml:space="preserve">Cada sección recibió la fotografía que mejor representa su contenido. Para la foto vertical </w:t>
+      </w:r>
+      <w:r>
+        <w:rPr>
+          <w:rFonts w:asciiTheme="minorHAnsi" w:hAnsiTheme="minorHAnsi" w:cstheme="minorHAnsi"/>
+          <w:lang w:val="es-EC"/>
+        </w:rPr>
+        <w:t>de la silla musical se generó un recorte horizontal que mantiene la proporción de las tarjetas.</w:t>
+      </w:r>
+    </w:p>
+    <w:p>
+      <w:pPr>
+        <w:pStyle w:val="Prrafodelista"/>
+        <w:numPr>
+          <w:ilvl w:val="0"/>
+          <w:numId w:val="22"/>
+        </w:numPr>
+        <w:jc w:val="both"/>
+        <w:rPr>
+          <w:rFonts w:asciiTheme="minorHAnsi" w:hAnsiTheme="minorHAnsi" w:cstheme="minorHAnsi"/>
+          <w:lang w:val="es-EC"/>
+        </w:rPr>
+      </w:pPr>
+      <w:r>
+        <w:rPr>
+          <w:rFonts w:asciiTheme="minorHAnsi" w:hAnsiTheme="minorHAnsi" w:cstheme="minorHAnsi"/>
+          <w:lang w:val="es-EC"/>
+        </w:rPr>
+        <w:t>Todas las imágenes y videos incluyen un texto alternativo que describe lo que muestran, para mejorar la accesibilidad.</w:t>
+      </w:r>
+    </w:p>
+    <w:p>
+      <w:pPr>
+        <w:keepNext/>
+        <w:numPr>
+          <w:ilvl w:val="0"/>
+          <w:numId w:val="20"/>
+        </w:numPr>
+        <w:jc w:val="both"/>
+        <w:rPr>
+          <w:rFonts w:cstheme="minorHAnsi"/>
+          <w:b/>
+          <w:bCs/>
+          <w:sz w:val="28"/>
+          <w:szCs w:val="28"/>
+          <w:lang w:val="es-EC"/>
+        </w:rPr>
+      </w:pPr>
+      <w:r>
+        <w:rPr>
+          <w:rFonts w:cstheme="minorHAnsi"/>
+          <w:b/>
+          <w:bCs/>
+          <w:sz w:val="28"/>
+          <w:szCs w:val="28"/>
+          <w:lang w:val="es-EC"/>
+        </w:rPr>
+        <w:t>Personalización de Estilos y Funcionalida</w:t>
+      </w:r>
+      <w:r>
+        <w:rPr>
+          <w:rFonts w:cstheme="minorHAnsi"/>
+          <w:b/>
+          <w:bCs/>
+          <w:sz w:val="28"/>
+          <w:szCs w:val="28"/>
+          <w:lang w:val="es-EC"/>
+        </w:rPr>
+        <w:t>des:</w:t>
+      </w:r>
+    </w:p>
+    <w:p>
+      <w:pPr>
+        <w:pStyle w:val="Prrafodelista"/>
+        <w:numPr>
+          <w:ilvl w:val="0"/>
+          <w:numId w:val="22"/>
+        </w:numPr>
+        <w:jc w:val="both"/>
+        <w:rPr>
+          <w:rFonts w:asciiTheme="minorHAnsi" w:hAnsiTheme="minorHAnsi" w:cstheme="minorHAnsi"/>
+          <w:lang w:val="es-EC"/>
+        </w:rPr>
+      </w:pPr>
+      <w:r>
+        <w:rPr>
+          <w:rFonts w:asciiTheme="minorHAnsi" w:hAnsiTheme="minorHAnsi" w:cstheme="minorHAnsi"/>
+          <w:b/>
+          <w:bCs/>
+          <w:lang w:val="es-EC"/>
+        </w:rPr>
+        <w:t xml:space="preserve">Fondo de la portada: </w:t>
+      </w:r>
+      <w:r>
+        <w:rPr>
+          <w:rFonts w:asciiTheme="minorHAnsi" w:hAnsiTheme="minorHAnsi" w:cstheme="minorHAnsi"/>
+          <w:lang w:val="es-EC"/>
+        </w:rPr>
+        <w:t>se cambió la imagen de fondo en main.css, noscript.css y sus archivos Sass.</w:t>
+      </w:r>
+    </w:p>
+    <w:p>
+      <w:pPr>
+        <w:pStyle w:val="Prrafodelista"/>
+        <w:numPr>
+          <w:ilvl w:val="0"/>
+          <w:numId w:val="22"/>
+        </w:numPr>
+        <w:jc w:val="both"/>
+        <w:rPr>
+          <w:rFonts w:asciiTheme="minorHAnsi" w:hAnsiTheme="minorHAnsi" w:cstheme="minorHAnsi"/>
+          <w:lang w:val="es-EC"/>
+        </w:rPr>
+      </w:pPr>
+      <w:r>
+        <w:rPr>
+          <w:rFonts w:asciiTheme="minorHAnsi" w:hAnsiTheme="minorHAnsi" w:cstheme="minorHAnsi"/>
+          <w:b/>
+          <w:bCs/>
+          <w:lang w:val="es-EC"/>
+        </w:rPr>
+        <w:t xml:space="preserve">Videos: </w:t>
+      </w:r>
+      <w:r>
+        <w:rPr>
+          <w:rFonts w:asciiTheme="minorHAnsi" w:hAnsiTheme="minorHAnsi" w:cstheme="minorHAnsi"/>
+          <w:lang w:val="es-EC"/>
+        </w:rPr>
+        <w:t>se agregó la regla .image video para que los videos ocupen el ancho de su contenedor.</w:t>
+      </w:r>
+    </w:p>
+    <w:p>
+      <w:pPr>
+        <w:pStyle w:val="Prrafodelista"/>
+        <w:numPr>
+          <w:ilvl w:val="0"/>
+          <w:numId w:val="22"/>
+        </w:numPr>
+        <w:jc w:val="both"/>
+        <w:rPr>
+          <w:rFonts w:asciiTheme="minorHAnsi" w:hAnsiTheme="minorHAnsi" w:cstheme="minorHAnsi"/>
+          <w:lang w:val="es-EC"/>
+        </w:rPr>
+      </w:pPr>
+      <w:r>
+        <w:rPr>
+          <w:rFonts w:asciiTheme="minorHAnsi" w:hAnsiTheme="minorHAnsi" w:cstheme="minorHAnsi"/>
+          <w:b/>
+          <w:bCs/>
+          <w:lang w:val="es-EC"/>
+        </w:rPr>
+        <w:t xml:space="preserve">Etiqueta de fecha: </w:t>
+      </w:r>
+      <w:r>
+        <w:rPr>
+          <w:rFonts w:asciiTheme="minorHAnsi" w:hAnsiTheme="minorHAnsi" w:cstheme="minorHAnsi"/>
+          <w:lang w:val="es-EC"/>
+        </w:rPr>
+        <w:t>las líneas decorativas tenían un ancho fi</w:t>
+      </w:r>
+      <w:r>
+        <w:rPr>
+          <w:rFonts w:asciiTheme="minorHAnsi" w:hAnsiTheme="minorHAnsi" w:cstheme="minorHAnsi"/>
+          <w:lang w:val="es-EC"/>
+        </w:rPr>
+        <w:t>jo y tapaban el texto “Fiestas Octubrinas - Octubre 2026”; se corrigió con flexbox para que se ajusten a cualquier longitud.</w:t>
+      </w:r>
+    </w:p>
+    <w:p>
+      <w:pPr>
+        <w:pStyle w:val="Prrafodelista"/>
+        <w:numPr>
+          <w:ilvl w:val="0"/>
+          <w:numId w:val="22"/>
+        </w:numPr>
+        <w:jc w:val="both"/>
+        <w:rPr>
+          <w:rFonts w:asciiTheme="minorHAnsi" w:hAnsiTheme="minorHAnsi" w:cstheme="minorHAnsi"/>
+          <w:lang w:val="es-EC"/>
+        </w:rPr>
+      </w:pPr>
+      <w:r>
+        <w:rPr>
+          <w:rFonts w:asciiTheme="minorHAnsi" w:hAnsiTheme="minorHAnsi" w:cstheme="minorHAnsi"/>
+          <w:b/>
+          <w:bCs/>
+          <w:lang w:val="es-EC"/>
+        </w:rPr>
+        <w:t xml:space="preserve">Visor de imágenes: </w:t>
+      </w:r>
+      <w:r>
+        <w:rPr>
+          <w:rFonts w:asciiTheme="minorHAnsi" w:hAnsiTheme="minorHAnsi" w:cstheme="minorHAnsi"/>
+          <w:lang w:val="es-EC"/>
+        </w:rPr>
+        <w:t>se crearon lightbox.css y lightbox.js usando el elemento nativo &lt;dialog&gt;. Se cierra con el botón, con la tecla E</w:t>
+      </w:r>
+      <w:r>
+        <w:rPr>
+          <w:rFonts w:asciiTheme="minorHAnsi" w:hAnsiTheme="minorHAnsi" w:cstheme="minorHAnsi"/>
+          <w:lang w:val="es-EC"/>
+        </w:rPr>
+        <w:t>sc o haciendo clic fuera de la imagen.</w:t>
+      </w:r>
+    </w:p>
+    <w:p>
+      <w:pPr>
+        <w:pStyle w:val="Prrafodelista"/>
+        <w:numPr>
+          <w:ilvl w:val="0"/>
+          <w:numId w:val="22"/>
+        </w:numPr>
+        <w:jc w:val="both"/>
+        <w:rPr>
+          <w:rFonts w:asciiTheme="minorHAnsi" w:hAnsiTheme="minorHAnsi" w:cstheme="minorHAnsi"/>
+          <w:lang w:val="es-EC"/>
+        </w:rPr>
+      </w:pPr>
+      <w:r>
+        <w:rPr>
+          <w:rFonts w:asciiTheme="minorHAnsi" w:hAnsiTheme="minorHAnsi" w:cstheme="minorHAnsi"/>
+          <w:b/>
+          <w:bCs/>
+          <w:lang w:val="es-EC"/>
+        </w:rPr>
+        <w:t xml:space="preserve">Redes: </w:t>
+      </w:r>
+      <w:r>
+        <w:rPr>
+          <w:rFonts w:asciiTheme="minorHAnsi" w:hAnsiTheme="minorHAnsi" w:cstheme="minorHAnsi"/>
+          <w:lang w:val="es-EC"/>
+        </w:rPr>
+        <w:t xml:space="preserve">se quitaron los botones de Facebook e Instagram y los botones de GitHub </w:t>
+      </w:r>
+      <w:r>
+        <w:rPr>
+          <w:rFonts w:asciiTheme="minorHAnsi" w:hAnsiTheme="minorHAnsi" w:cstheme="minorHAnsi"/>
+          <w:lang w:val="es-EC"/>
+        </w:rPr>
+        <w:lastRenderedPageBreak/>
+        <w:t>enlazan a https://github.com/IvanAlvarado999/Proyecto-02-Sprint1-.</w:t>
+      </w:r>
+    </w:p>
+    <w:p>
+      <w:pPr>
+        <w:keepNext/>
+        <w:numPr>
+          <w:ilvl w:val="0"/>
+          <w:numId w:val="20"/>
+        </w:numPr>
+        <w:jc w:val="both"/>
+        <w:rPr>
+          <w:rFonts w:cstheme="minorHAnsi"/>
+          <w:b/>
+          <w:bCs/>
+          <w:sz w:val="28"/>
+          <w:szCs w:val="28"/>
+          <w:lang w:val="es-EC"/>
+        </w:rPr>
+      </w:pPr>
+      <w:r>
+        <w:rPr>
+          <w:rFonts w:cstheme="minorHAnsi"/>
+          <w:b/>
+          <w:bCs/>
+          <w:sz w:val="28"/>
+          <w:szCs w:val="28"/>
+          <w:lang w:val="es-EC"/>
+        </w:rPr>
+        <w:t>Verificación del Sitio:</w:t>
+      </w:r>
+    </w:p>
+    <w:p>
+      <w:pPr>
+        <w:pStyle w:val="Prrafodelista"/>
+        <w:numPr>
+          <w:ilvl w:val="0"/>
+          <w:numId w:val="22"/>
+        </w:numPr>
+        <w:jc w:val="both"/>
+        <w:rPr>
+          <w:rFonts w:asciiTheme="minorHAnsi" w:hAnsiTheme="minorHAnsi" w:cstheme="minorHAnsi"/>
+          <w:lang w:val="es-EC"/>
+        </w:rPr>
+      </w:pPr>
+      <w:r>
+        <w:rPr>
+          <w:rFonts w:asciiTheme="minorHAnsi" w:hAnsiTheme="minorHAnsi" w:cstheme="minorHAnsi"/>
+          <w:lang w:val="es-EC"/>
+        </w:rPr>
+        <w:t>Se comprobó en un navegador de escritorio (1280</w:t>
+      </w:r>
+      <w:r>
+        <w:rPr>
+          <w:rFonts w:asciiTheme="minorHAnsi" w:hAnsiTheme="minorHAnsi" w:cstheme="minorHAnsi"/>
+          <w:lang w:val="es-EC"/>
+        </w:rPr>
+        <w:t xml:space="preserve"> px) y en una vista móvil (390 px) que las imágenes, los videos y los enlaces cargan sin errores y que el visor se abre y se cierra correctamente.</w:t>
+      </w:r>
+    </w:p>
+    <w:p>
+      <w:pPr>
+        <w:keepNext/>
+        <w:spacing w:before="120" w:after="60"/>
+        <w:jc w:val="center"/>
+      </w:pPr>
+      <w:r>
+        <w:rPr>
+          <w:noProof/>
+          <w:lang w:val="es-EC" w:eastAsia="es-EC"/>
+        </w:rPr>
+        <w:drawing>
+          <wp:inline distT="0" distB="0" distL="0" distR="0">
+            <wp:extent cx="3121313" cy="4680000"/>
+            <wp:effectExtent l="0" t="0" r="0" b="0"/>
+            <wp:docPr id="103" name="Figura 3" descr="Sección “Galería del Evento” con el video principal, la cuadrícula de fotografías y los videos complementarios."/>
+            <wp:cNvGraphicFramePr>
+              <a:graphicFrameLocks xmlns:a="http://schemas.openxmlformats.org/drawingml/2006/main" noChangeAspect="1"/>
+            </wp:cNvGraphicFramePr>
+            <a:graphic xmlns:a="http://schemas.openxmlformats.org/drawingml/2006/main">
+              <a:graphicData uri="http://schemas.openxmlformats.org/drawingml/2006/picture">
+                <pic:pic xmlns:pic="http://schemas.openxmlformats.org/drawingml/2006/picture">
+                  <pic:nvPicPr>
+                    <pic:cNvPr id="103" name="figura3.jpg"/>
+                    <pic:cNvPicPr/>
+                  </pic:nvPicPr>
+                  <pic:blipFill>
+                    <a:blip r:embed="rId11"/>
+                    <a:stretch>
+                      <a:fillRect/>
+                    </a:stretch>
+                  </pic:blipFill>
+                  <pic:spPr>
+                    <a:xfrm>
+                      <a:off x="0" y="0"/>
+                      <a:ext cx="3121313" cy="4680000"/>
+                    </a:xfrm>
+                    <a:prstGeom prst="rect">
+                      <a:avLst/>
+                    </a:prstGeom>
+                    <a:ln w="6350">
+                      <a:solidFill>
+                        <a:srgbClr val="BFBFBF"/>
+                      </a:solidFill>
+                    </a:ln>
+                  </pic:spPr>
+                </pic:pic>
+              </a:graphicData>
+            </a:graphic>
+          </wp:inline>
+        </w:drawing>
+      </w:r>
+    </w:p>
+    <w:p>
+      <w:pPr>
+        <w:spacing w:after="240"/>
+        <w:jc w:val="center"/>
+      </w:pPr>
+      <w:r>
+        <w:rPr>
+          <w:rFonts w:cstheme="minorHAnsi"/>
+          <w:b/>
+          <w:bCs/>
+          <w:i/>
+          <w:iCs/>
+          <w:color w:val="595959"/>
+          <w:sz w:val="18"/>
+          <w:szCs w:val="18"/>
+          <w:lang w:val="es-EC"/>
+        </w:rPr>
+        <w:t xml:space="preserve">Figura 3. </w:t>
+      </w:r>
+      <w:r>
+        <w:rPr>
+          <w:rFonts w:cstheme="minorHAnsi"/>
+          <w:i/>
+          <w:iCs/>
+          <w:color w:val="595959"/>
+          <w:sz w:val="18"/>
+          <w:szCs w:val="18"/>
+          <w:lang w:val="es-EC"/>
+        </w:rPr>
+        <w:t>Sección “Galería del Evento” con el video principal, la cuadrícula de fotografías y los videos complementarios.</w:t>
+      </w:r>
+    </w:p>
+    <w:p>
+      <w:pPr>
+        <w:keepNext/>
+        <w:spacing w:before="120" w:after="60"/>
+        <w:jc w:val="center"/>
+      </w:pPr>
+      <w:r>
+        <w:rPr>
+          <w:noProof/>
+          <w:lang w:val="es-EC" w:eastAsia="es-EC"/>
+        </w:rPr>
+        <w:lastRenderedPageBreak/>
+        <w:drawing>
+          <wp:inline distT="0" distB="0" distL="0" distR="0">
+            <wp:extent cx="5040000" cy="3150000"/>
+            <wp:effectExtent l="0" t="0" r="0" b="0"/>
+            <wp:docPr id="104" name="Figura 4" descr="Visor de imágenes abierto sobre la fotografía de la silla musical, con su descripción y el botón para cerrar."/>
+            <wp:cNvGraphicFramePr>
+              <a:graphicFrameLocks xmlns:a="http://schemas.openxmlformats.org/drawingml/2006/main" noChangeAspect="1"/>
+            </wp:cNvGraphicFramePr>
+            <a:graphic xmlns:a="http://schemas.openxmlformats.org/drawingml/2006/main">
+              <a:graphicData uri="http://schemas.openxmlformats.org/drawingml/2006/picture">
+                <pic:pic xmlns:pic="http://schemas.openxmlformats.org/drawingml/2006/picture">
+                  <pic:nvPicPr>
+                    <pic:cNvPr id="104" name="figura4.jpg"/>
+                    <pic:cNvPicPr/>
+                  </pic:nvPicPr>
+                  <pic:blipFill>
+                    <a:blip r:embed="rId12"/>
+                    <a:stretch>
+                      <a:fillRect/>
+                    </a:stretch>
+                  </pic:blipFill>
+                  <pic:spPr>
+                    <a:xfrm>
+                      <a:off x="0" y="0"/>
+                      <a:ext cx="5040000" cy="3150000"/>
+                    </a:xfrm>
+                    <a:prstGeom prst="rect">
+                      <a:avLst/>
+                    </a:prstGeom>
+                    <a:ln w="6350">
+                      <a:solidFill>
+                        <a:srgbClr val="BFBFBF"/>
+                      </a:solidFill>
+                    </a:ln>
+                  </pic:spPr>
+                </pic:pic>
+              </a:graphicData>
+            </a:graphic>
+          </wp:inline>
+        </w:drawing>
+      </w:r>
+    </w:p>
+    <w:p>
+      <w:pPr>
+        <w:spacing w:after="240"/>
+        <w:jc w:val="center"/>
+      </w:pPr>
+      <w:r>
+        <w:rPr>
+          <w:rFonts w:cstheme="minorHAnsi"/>
+          <w:b/>
+          <w:bCs/>
+          <w:i/>
+          <w:iCs/>
+          <w:color w:val="595959"/>
+          <w:sz w:val="18"/>
+          <w:szCs w:val="18"/>
+          <w:lang w:val="es-EC"/>
+        </w:rPr>
+        <w:t xml:space="preserve">Figura 4. </w:t>
+      </w:r>
+      <w:r>
+        <w:rPr>
+          <w:rFonts w:cstheme="minorHAnsi"/>
+          <w:i/>
+          <w:iCs/>
+          <w:color w:val="595959"/>
+          <w:sz w:val="18"/>
+          <w:szCs w:val="18"/>
+          <w:lang w:val="es-EC"/>
+        </w:rPr>
+        <w:t>Visor de imágenes abierto sobre la fotografía de la silla musical, con su descripción y el botón para cerrar.</w:t>
+      </w:r>
+    </w:p>
+    <w:p>
+      <w:pPr>
+        <w:keepNext/>
+        <w:spacing w:before="120" w:after="60"/>
+        <w:jc w:val="center"/>
+      </w:pPr>
+      <w:r>
+        <w:rPr>
+          <w:noProof/>
+          <w:lang w:val="es-EC" w:eastAsia="es-EC"/>
+        </w:rPr>
+        <w:drawing>
+          <wp:inline distT="0" distB="0" distL="0" distR="0">
+            <wp:extent cx="3241706" cy="3420000"/>
+            <wp:effectExtent l="0" t="0" r="0" b="0"/>
+            <wp:docPr id="105" name="Figura 5" descr="Vista móvil del sitio: portada y tarjeta “Voces de la Comunidad”."/>
+            <wp:cNvGraphicFramePr>
+              <a:graphicFrameLocks xmlns:a="http://schemas.openxmlformats.org/drawingml/2006/main" noChangeAspect="1"/>
+            </wp:cNvGraphicFramePr>
+            <a:graphic xmlns:a="http://schemas.openxmlformats.org/drawingml/2006/main">
+              <a:graphicData uri="http://schemas.openxmlformats.org/drawingml/2006/picture">
+                <pic:pic xmlns:pic="http://schemas.openxmlformats.org/drawingml/2006/picture">
+                  <pic:nvPicPr>
+                    <pic:cNvPr id="105" name="figura5.jpg"/>
+                    <pic:cNvPicPr/>
+                  </pic:nvPicPr>
+                  <pic:blipFill>
+                    <a:blip r:embed="rId13"/>
+                    <a:stretch>
+                      <a:fillRect/>
+                    </a:stretch>
+                  </pic:blipFill>
+                  <pic:spPr>
+                    <a:xfrm>
+                      <a:off x="0" y="0"/>
+                      <a:ext cx="3241706" cy="3420000"/>
+                    </a:xfrm>
+                    <a:prstGeom prst="rect">
+                      <a:avLst/>
+                    </a:prstGeom>
+                    <a:ln w="6350">
+                      <a:solidFill>
+                        <a:srgbClr val="BFBFBF"/>
+                      </a:solidFill>
+                    </a:ln>
+                  </pic:spPr>
+                </pic:pic>
+              </a:graphicData>
+            </a:graphic>
+          </wp:inline>
+        </w:drawing>
+      </w:r>
+    </w:p>
+    <w:p>
+      <w:pPr>
+        <w:spacing w:after="240"/>
+        <w:jc w:val="center"/>
+      </w:pPr>
+      <w:r>
+        <w:rPr>
+          <w:rFonts w:cstheme="minorHAnsi"/>
+          <w:b/>
+          <w:bCs/>
+          <w:i/>
+          <w:iCs/>
+          <w:color w:val="595959"/>
+          <w:sz w:val="18"/>
+          <w:szCs w:val="18"/>
+          <w:lang w:val="es-EC"/>
+        </w:rPr>
+        <w:t xml:space="preserve">Figura 5. </w:t>
+      </w:r>
+      <w:r>
+        <w:rPr>
+          <w:rFonts w:cstheme="minorHAnsi"/>
+          <w:i/>
+          <w:iCs/>
+          <w:color w:val="595959"/>
+          <w:sz w:val="18"/>
+          <w:szCs w:val="18"/>
+          <w:lang w:val="es-EC"/>
+        </w:rPr>
+        <w:t>Vista móvi</w:t>
+      </w:r>
+      <w:r>
+        <w:rPr>
+          <w:rFonts w:cstheme="minorHAnsi"/>
+          <w:i/>
+          <w:iCs/>
+          <w:color w:val="595959"/>
+          <w:sz w:val="18"/>
+          <w:szCs w:val="18"/>
+          <w:lang w:val="es-EC"/>
+        </w:rPr>
+        <w:t>l del sitio: portada y tarjeta “Voces de la Comunidad”.</w:t>
+      </w:r>
+    </w:p>
+    <w:p>
+      <w:pPr>
+        <w:keepNext/>
+        <w:spacing w:before="120" w:after="60"/>
+        <w:jc w:val="center"/>
+      </w:pPr>
+      <w:r>
+        <w:rPr>
+          <w:noProof/>
+          <w:lang w:val="es-EC" w:eastAsia="es-EC"/>
+        </w:rPr>
+        <w:lastRenderedPageBreak/>
+        <w:drawing>
+          <wp:inline distT="0" distB="0" distL="0" distR="0">
+            <wp:extent cx="4680000" cy="2886590"/>
+            <wp:effectExtent l="0" t="0" r="0" b="0"/>
+            <wp:docPr id="106" name="Figura 6" descr="Pie de página con el formulario de propuestas, los datos del proyecto y el enlace a GitHub."/>
+            <wp:cNvGraphicFramePr>
+              <a:graphicFrameLocks xmlns:a="http://schemas.openxmlformats.org/drawingml/2006/main" noChangeAspect="1"/>
+            </wp:cNvGraphicFramePr>
+            <a:graphic xmlns:a="http://schemas.openxmlformats.org/drawingml/2006/main">
+              <a:graphicData uri="http://schemas.openxmlformats.org/drawingml/2006/picture">
+                <pic:pic xmlns:pic="http://schemas.openxmlformats.org/drawingml/2006/picture">
+                  <pic:nvPicPr>
+                    <pic:cNvPr id="106" name="figura6.jpg"/>
+                    <pic:cNvPicPr/>
+                  </pic:nvPicPr>
+                  <pic:blipFill>
+                    <a:blip r:embed="rId14"/>
+                    <a:stretch>
+                      <a:fillRect/>
+                    </a:stretch>
+                  </pic:blipFill>
+                  <pic:spPr>
+                    <a:xfrm>
+                      <a:off x="0" y="0"/>
+                      <a:ext cx="4680000" cy="2886590"/>
+                    </a:xfrm>
+                    <a:prstGeom prst="rect">
+                      <a:avLst/>
+                    </a:prstGeom>
+                    <a:ln w="6350">
+                      <a:solidFill>
+                        <a:srgbClr val="BFBFBF"/>
+                      </a:solidFill>
+                    </a:ln>
+                  </pic:spPr>
+                </pic:pic>
+              </a:graphicData>
+            </a:graphic>
+          </wp:inline>
+        </w:drawing>
+      </w:r>
+    </w:p>
+    <w:p>
+      <w:pPr>
+        <w:spacing w:after="240"/>
+        <w:jc w:val="center"/>
+      </w:pPr>
+      <w:r>
+        <w:rPr>
+          <w:rFonts w:cstheme="minorHAnsi"/>
+          <w:b/>
+          <w:bCs/>
+          <w:i/>
+          <w:iCs/>
+          <w:color w:val="595959"/>
+          <w:sz w:val="18"/>
+          <w:szCs w:val="18"/>
+          <w:lang w:val="es-EC"/>
+        </w:rPr>
+        <w:t xml:space="preserve">Figura 6. </w:t>
+      </w:r>
+      <w:r>
+        <w:rPr>
+          <w:rFonts w:cstheme="minorHAnsi"/>
+          <w:i/>
+          <w:iCs/>
+          <w:color w:val="595959"/>
+          <w:sz w:val="18"/>
+          <w:szCs w:val="18"/>
+          <w:lang w:val="es-EC"/>
+        </w:rPr>
+        <w:t>Pie de página con el formulario de propuestas, los datos del proyecto y el enlace a GitHub.</w:t>
       </w:r>
     </w:p>
     <w:p>
@@ -4798,6 +5203,7 @@
     </w:p>
     <w:p>
       <w:pPr>
+        <w:keepNext/>
         <w:numPr>
           <w:ilvl w:val="0"/>
           <w:numId w:val="18"/>
@@ -4821,7 +5227,6 @@
           <w:szCs w:val="28"/>
           <w:lang w:val="es-EC"/>
         </w:rPr>
-        <w:lastRenderedPageBreak/>
         <w:t>Control de Versiones y Repositorio Remoto:</w:t>
       </w:r>
     </w:p>
@@ -4853,7 +5258,6 @@
           <w:numId w:val="18"/>
         </w:numPr>
         <w:spacing w:after="0" w:line="240" w:lineRule="auto"/>
-        <w:jc w:val="both"/>
         <w:rPr>
           <w:rFonts w:eastAsia="Arial" w:cstheme="minorHAnsi"/>
           <w:lang w:val="es-EC"/>
@@ -4864,7 +5268,14 @@
           <w:rFonts w:eastAsia="Arial" w:cstheme="minorHAnsi"/>
           <w:lang w:val="es-EC"/>
         </w:rPr>
-        <w:t>Se vinculó el proyecto a un repositorio público en GitHub.</w:t>
+        <w:t>Se vinculó el proyecto al repositorio público https://github.com/IvanAlvarado9</w:t>
+      </w:r>
+      <w:r>
+        <w:rPr>
+          <w:rFonts w:eastAsia="Arial" w:cstheme="minorHAnsi"/>
+          <w:lang w:val="es-EC"/>
+        </w:rPr>
+        <w:t>99/Proyecto-02-Sprint1-.</w:t>
       </w:r>
     </w:p>
     <w:p>
@@ -4885,27 +5296,12 @@
           <w:rFonts w:eastAsia="Arial" w:cstheme="minorHAnsi"/>
           <w:lang w:val="es-EC"/>
         </w:rPr>
-        <w:t>Se gestionó el versionado mediante confirmaciones (</w:t>
-      </w:r>
-      <w:proofErr w:type="spellStart"/>
-      <w:r>
-        <w:rPr>
-          <w:rFonts w:eastAsia="Arial" w:cstheme="minorHAnsi"/>
-          <w:lang w:val="es-EC"/>
-        </w:rPr>
-        <w:t>commits</w:t>
-      </w:r>
-      <w:proofErr w:type="spellEnd"/>
-      <w:r>
-        <w:rPr>
-          <w:rFonts w:eastAsia="Arial" w:cstheme="minorHAnsi"/>
-          <w:lang w:val="es-EC"/>
-        </w:rPr>
-        <w:t>) descriptivas para cada módulo maquetado y ajuste de contenido.</w:t>
-      </w:r>
-    </w:p>
-    <w:p>
-      <w:pPr>
+        <w:t>Los cambios se registraron con commits descriptivos y atómicos: cada modificación (por ejemplo, agregar la fotografía de una sección o corregir un estilo) se guardó en un commit independiente.</w:t>
+      </w:r>
+    </w:p>
+    <w:p>
+      <w:pPr>
+        <w:keepNext/>
         <w:numPr>
           <w:ilvl w:val="0"/>
           <w:numId w:val="18"/>
@@ -4950,39 +5346,14 @@
           <w:rFonts w:eastAsia="Arial" w:cstheme="minorHAnsi"/>
           <w:lang w:val="es-EC"/>
         </w:rPr>
-        <w:t>Se configuró el servicio de GitHub Pages apuntando a la rama principal (</w:t>
-      </w:r>
-      <w:proofErr w:type="spellStart"/>
+        <w:t>Se config</w:t>
+      </w:r>
       <w:r>
         <w:rPr>
           <w:rFonts w:eastAsia="Arial" w:cstheme="minorHAnsi"/>
           <w:lang w:val="es-EC"/>
         </w:rPr>
-        <w:t>main</w:t>
-      </w:r>
-      <w:proofErr w:type="spellEnd"/>
-      <w:r>
-        <w:rPr>
-          <w:rFonts w:eastAsia="Arial" w:cstheme="minorHAnsi"/>
-          <w:lang w:val="es-EC"/>
-        </w:rPr>
-        <w:t xml:space="preserve"> o master) desde el directorio raíz (/</w:t>
-      </w:r>
-      <w:proofErr w:type="spellStart"/>
-      <w:r>
-        <w:rPr>
-          <w:rFonts w:eastAsia="Arial" w:cstheme="minorHAnsi"/>
-          <w:lang w:val="es-EC"/>
-        </w:rPr>
-        <w:t>root</w:t>
-      </w:r>
-      <w:proofErr w:type="spellEnd"/>
-      <w:r>
-        <w:rPr>
-          <w:rFonts w:eastAsia="Arial" w:cstheme="minorHAnsi"/>
-          <w:lang w:val="es-EC"/>
-        </w:rPr>
-        <w:t>).</w:t>
+        <w:t>uró GitHub Pages para publicar desde la rama main, en la carpeta raíz (/).</w:t>
       </w:r>
     </w:p>
     <w:p>
@@ -5001,73 +5372,47 @@
       <w:r>
         <w:rPr>
           <w:rFonts w:eastAsia="Arial" w:cstheme="minorHAnsi"/>
-          <w:lang w:val="es-EC"/>
-        </w:rPr>
-        <w:t xml:space="preserve">Flujo de Despliegue: Cada actualización enviada mediante </w:t>
-      </w:r>
-      <w:proofErr w:type="spellStart"/>
+          <w:b/>
+          <w:bCs/>
+          <w:lang w:val="es-EC"/>
+        </w:rPr>
+        <w:t xml:space="preserve">Flujo de despliegue: </w:t>
+      </w:r>
       <w:r>
         <w:rPr>
           <w:rFonts w:eastAsia="Arial" w:cstheme="minorHAnsi"/>
           <w:lang w:val="es-EC"/>
         </w:rPr>
-        <w:t>git</w:t>
-      </w:r>
-      <w:proofErr w:type="spellEnd"/>
-      <w:r>
+        <w:t>cada git push a la rama main activa el flujo automático de GitHub Pages, que publica la nueva versión del sitio en pocos minutos.</w:t>
+      </w:r>
+    </w:p>
+    <w:p>
+      <w:pPr>
+        <w:numPr>
+          <w:ilvl w:val="1"/>
+          <w:numId w:val="18"/>
+        </w:numPr>
+        <w:spacing w:after="0" w:line="240" w:lineRule="auto"/>
         <w:rPr>
           <w:rFonts w:eastAsia="Arial" w:cstheme="minorHAnsi"/>
           <w:lang w:val="es-EC"/>
         </w:rPr>
-        <w:t xml:space="preserve"> </w:t>
-      </w:r>
-      <w:proofErr w:type="spellStart"/>
+      </w:pPr>
       <w:r>
         <w:rPr>
           <w:rFonts w:eastAsia="Arial" w:cstheme="minorHAnsi"/>
-          <w:lang w:val="es-EC"/>
-        </w:rPr>
-        <w:t>push</w:t>
-      </w:r>
-      <w:proofErr w:type="spellEnd"/>
+          <w:b/>
+          <w:bCs/>
+          <w:lang w:val="es-EC"/>
+        </w:rPr>
+        <w:t xml:space="preserve">Enlace público del sitio: </w:t>
+      </w:r>
       <w:r>
         <w:rPr>
           <w:rFonts w:eastAsia="Arial" w:cstheme="minorHAnsi"/>
           <w:lang w:val="es-EC"/>
         </w:rPr>
-        <w:t xml:space="preserve"> activa el pipeline automático de </w:t>
-      </w:r>
-      <w:proofErr w:type="spellStart"/>
-      <w:r>
-        <w:rPr>
-          <w:rFonts w:eastAsia="Arial" w:cstheme="minorHAnsi"/>
-          <w:lang w:val="es-EC"/>
-        </w:rPr>
-        <w:t>GitHub</w:t>
-      </w:r>
-      <w:proofErr w:type="spellEnd"/>
-      <w:r>
-        <w:rPr>
-          <w:rFonts w:eastAsia="Arial" w:cstheme="minorHAnsi"/>
-          <w:lang w:val="es-EC"/>
-        </w:rPr>
-        <w:t xml:space="preserve"> </w:t>
-      </w:r>
-      <w:proofErr w:type="spellStart"/>
-      <w:r>
-        <w:rPr>
-          <w:rFonts w:eastAsia="Arial" w:cstheme="minorHAnsi"/>
-          <w:lang w:val="es-EC"/>
-        </w:rPr>
-        <w:t>Actions</w:t>
-      </w:r>
-      <w:proofErr w:type="spellEnd"/>
-      <w:r>
-        <w:rPr>
-          <w:rFonts w:eastAsia="Arial" w:cstheme="minorHAnsi"/>
-          <w:lang w:val="es-EC"/>
-        </w:rPr>
-        <w:t>, el cual compila y publica los cambios de forma instantánea.</w:t>
+        <w:t>https://ivanalvarado999.github.io/Proyecto-02-Sprint1-/</w:t>
       </w:r>
     </w:p>
     <w:p>
@@ -5088,7 +5433,7 @@
           <w:rFonts w:eastAsia="Arial" w:cstheme="minorHAnsi"/>
           <w:lang w:val="es-EC"/>
         </w:rPr>
-        <w:t>Enlace Público del Sitio: El sitio web quedó publicado y operativo de manera accesible en la web a través de la URL generada</w:t>
+        <w:t>Tras cada despliegue se revisa en el enlace público que los contenidos, las imágenes, los videos, los enlaces y los estilos se visualicen correctamente.</w:t>
       </w:r>
     </w:p>
     <w:p>
@@ -5106,15 +5451,14 @@
         </w:rPr>
       </w:pPr>
       <w:bookmarkStart w:id="6" w:name="_Toc229685207"/>
-      <w:proofErr w:type="spellStart"/>
       <w:r>
         <w:rPr>
           <w:lang w:val="en-US"/>
         </w:rPr>
+        <w:lastRenderedPageBreak/>
         <w:t>Bibliografía</w:t>
       </w:r>
       <w:bookmarkEnd w:id="6"/>
-      <w:proofErr w:type="spellEnd"/>
     </w:p>
     <w:p>
       <w:pPr>
@@ -5136,23 +5480,7 @@
           <w:rFonts w:asciiTheme="minorHAnsi" w:hAnsiTheme="minorHAnsi" w:cstheme="minorHAnsi"/>
           <w:lang w:val="en-US"/>
         </w:rPr>
-        <w:t>HTML5 UP. (</w:t>
-      </w:r>
-      <w:proofErr w:type="spellStart"/>
-      <w:r>
-        <w:rPr>
-          <w:rFonts w:asciiTheme="minorHAnsi" w:hAnsiTheme="minorHAnsi" w:cstheme="minorHAnsi"/>
-          <w:lang w:val="en-US"/>
-        </w:rPr>
-        <w:t>s.f.</w:t>
-      </w:r>
-      <w:proofErr w:type="spellEnd"/>
-      <w:r>
-        <w:rPr>
-          <w:rFonts w:asciiTheme="minorHAnsi" w:hAnsiTheme="minorHAnsi" w:cstheme="minorHAnsi"/>
-          <w:lang w:val="en-US"/>
-        </w:rPr>
-        <w:t xml:space="preserve">). Massively: A responsive, storytelling HTML5 site template. </w:t>
+        <w:t xml:space="preserve">HTML5 UP. (s.f.). Massively: A responsive, storytelling HTML5 site template. </w:t>
       </w:r>
       <w:r>
         <w:rPr>
@@ -5161,7 +5489,7 @@
         </w:rPr>
         <w:t xml:space="preserve">Recuperado de </w:t>
       </w:r>
-      <w:hyperlink r:id="rId9" w:tgtFrame="_blank" w:history="1">
+      <w:hyperlink r:id="rId15" w:tgtFrame="_blank" w:history="1">
         <w:r>
           <w:rPr>
             <w:rFonts w:asciiTheme="minorHAnsi" w:hAnsiTheme="minorHAnsi" w:cstheme="minorHAnsi"/>
@@ -5191,23 +5519,7 @@
           <w:rFonts w:asciiTheme="minorHAnsi" w:hAnsiTheme="minorHAnsi" w:cstheme="minorHAnsi"/>
           <w:lang w:val="en-US"/>
         </w:rPr>
-        <w:t>HTML5 UP. (</w:t>
-      </w:r>
-      <w:proofErr w:type="spellStart"/>
-      <w:r>
-        <w:rPr>
-          <w:rFonts w:asciiTheme="minorHAnsi" w:hAnsiTheme="minorHAnsi" w:cstheme="minorHAnsi"/>
-          <w:lang w:val="en-US"/>
-        </w:rPr>
-        <w:t>s.f.</w:t>
-      </w:r>
-      <w:proofErr w:type="spellEnd"/>
-      <w:r>
-        <w:rPr>
-          <w:rFonts w:asciiTheme="minorHAnsi" w:hAnsiTheme="minorHAnsi" w:cstheme="minorHAnsi"/>
-          <w:lang w:val="en-US"/>
-        </w:rPr>
-        <w:t xml:space="preserve">). Spectral &amp; Alpha site templates. </w:t>
+        <w:t xml:space="preserve">HTML5 UP. (s.f.). Spectral &amp; Alpha site templates. </w:t>
       </w:r>
       <w:r>
         <w:rPr>
@@ -5216,7 +5528,7 @@
         </w:rPr>
         <w:t xml:space="preserve">Recuperado de </w:t>
       </w:r>
-      <w:hyperlink r:id="rId10" w:tgtFrame="_blank" w:history="1">
+      <w:hyperlink r:id="rId16" w:tgtFrame="_blank" w:history="1">
         <w:r>
           <w:rPr>
             <w:rFonts w:asciiTheme="minorHAnsi" w:hAnsiTheme="minorHAnsi" w:cstheme="minorHAnsi"/>
@@ -5246,31 +5558,15 @@
           <w:rFonts w:asciiTheme="minorHAnsi" w:hAnsiTheme="minorHAnsi" w:cstheme="minorHAnsi"/>
           <w:lang w:val="es-EC"/>
         </w:rPr>
-        <w:t xml:space="preserve">Mozilla </w:t>
-      </w:r>
-      <w:proofErr w:type="spellStart"/>
-      <w:r>
-        <w:rPr>
-          <w:rFonts w:asciiTheme="minorHAnsi" w:hAnsiTheme="minorHAnsi" w:cstheme="minorHAnsi"/>
-          <w:lang w:val="es-EC"/>
-        </w:rPr>
-        <w:t>Developer</w:t>
-      </w:r>
-      <w:proofErr w:type="spellEnd"/>
-      <w:r>
-        <w:rPr>
-          <w:rFonts w:asciiTheme="minorHAnsi" w:hAnsiTheme="minorHAnsi" w:cstheme="minorHAnsi"/>
-          <w:lang w:val="es-EC"/>
-        </w:rPr>
-        <w:t xml:space="preserve"> Network (MDN). (2026). Estructura y elementos semánticos de HTML5. MDN Web Docs. Recuperado de </w:t>
-      </w:r>
-      <w:hyperlink r:id="rId11" w:tgtFrame="_blank" w:history="1">
+        <w:t xml:space="preserve">Mozilla Developer Network (MDN). (2026). Estructura y elementos semánticos de HTML5. MDN Web Docs. Recuperado de </w:t>
+      </w:r>
+      <w:hyperlink r:id="rId17" w:tgtFrame="_blank" w:history="1">
         <w:r>
           <w:rPr>
             <w:rFonts w:asciiTheme="minorHAnsi" w:hAnsiTheme="minorHAnsi" w:cstheme="minorHAnsi"/>
             <w:lang w:val="es-EC"/>
           </w:rPr>
-          <w:t>https://developer.mozilla.org/es/docs/Glossary/Semantics#html_semantics</w:t>
+          <w:t>https://developer.mozilla.org/es/docs/Glossary/Semantics</w:t>
         </w:r>
       </w:hyperlink>
     </w:p>
@@ -5296,7 +5592,7 @@
         </w:rPr>
         <w:t xml:space="preserve">GitHub, Inc. (2026). Documentación de GitHub Pages: Creación y publicación de sitios estáticos. GitHub Docs. Recuperado de </w:t>
       </w:r>
-      <w:hyperlink r:id="rId12" w:tgtFrame="_blank" w:history="1">
+      <w:hyperlink r:id="rId18" w:tgtFrame="_blank" w:history="1">
         <w:r>
           <w:rPr>
             <w:rFonts w:asciiTheme="minorHAnsi" w:hAnsiTheme="minorHAnsi" w:cstheme="minorHAnsi"/>
@@ -5306,8 +5602,55 @@
         </w:r>
       </w:hyperlink>
     </w:p>
+    <w:p>
+      <w:pPr>
+        <w:pStyle w:val="Prrafodelista"/>
+        <w:numPr>
+          <w:ilvl w:val="0"/>
+          <w:numId w:val="19"/>
+        </w:numPr>
+        <w:rPr>
+          <w:rFonts w:asciiTheme="minorHAnsi" w:hAnsiTheme="minorHAnsi" w:cstheme="minorHAnsi"/>
+          <w:lang w:val="es-EC"/>
+        </w:rPr>
+      </w:pPr>
+      <w:r>
+        <w:rPr>
+          <w:rFonts w:asciiTheme="minorHAnsi" w:hAnsiTheme="minorHAnsi" w:cstheme="minorHAnsi"/>
+          <w:lang w:val="es-EC"/>
+        </w:rPr>
+        <w:t>Mozilla Developer Network (MDN). (2026). &lt;dialog&gt;: El elemento de diálogo. MDN Web Docs. Recuperado de https://developer.mozilla.org/es/docs/Web/HTML/Element/dialog</w:t>
+      </w:r>
+    </w:p>
+    <w:p>
+      <w:pPr>
+        <w:pStyle w:val="Prrafodelista"/>
+        <w:numPr>
+          <w:ilvl w:val="0"/>
+          <w:numId w:val="19"/>
+        </w:numPr>
+        <w:rPr>
+          <w:rFonts w:asciiTheme="minorHAnsi" w:hAnsiTheme="minorHAnsi" w:cstheme="minorHAnsi"/>
+          <w:lang w:val="es-EC"/>
+        </w:rPr>
+      </w:pPr>
+      <w:r>
+        <w:rPr>
+          <w:rFonts w:asciiTheme="minorHAnsi" w:hAnsiTheme="minorHAnsi" w:cstheme="minorHAnsi"/>
+          <w:lang w:val="es-EC"/>
+        </w:rPr>
+        <w:t>Mozilla Developer Network (MDN). (2026). &lt;video&gt;: El elemento de video in</w:t>
+      </w:r>
+      <w:r>
+        <w:rPr>
+          <w:rFonts w:asciiTheme="minorHAnsi" w:hAnsiTheme="minorHAnsi" w:cstheme="minorHAnsi"/>
+          <w:lang w:val="es-EC"/>
+        </w:rPr>
+        <w:t>crustado. MDN Web Docs. Recuperado de https://developer.mozilla.org/es/docs/Web/HTML/Element/video</w:t>
+      </w:r>
+    </w:p>
     <w:sectPr>
-      <w:headerReference w:type="default" r:id="rId13"/>
+      <w:headerReference w:type="default" r:id="rId19"/>
       <w:pgSz w:w="11906" w:h="16838"/>
       <w:pgMar w:top="2650" w:right="1701" w:bottom="1417" w:left="1701" w:header="708" w:footer="708" w:gutter="0"/>
       <w:pgNumType w:start="0"/>
@@ -9260,7 +9603,7 @@
 
 <file path=customXml/item1.xml><?xml version="1.0" encoding="utf-8"?>
 <CoverPageProperties xmlns="http://schemas.microsoft.com/office/2006/coverPageProps">
-  <PublishDate>2026-10-15T00:00:00</PublishDate>
+  <PublishDate>23 de octubre de 2026</PublishDate>
   <Abstract/>
   <CompanyAddress/>
   <CompanyPhone/>
@@ -9282,7 +9625,7 @@
 </file>
 
 <file path=customXml/itemProps2.xml><?xml version="1.0" encoding="utf-8"?>
-<ds:datastoreItem xmlns:ds="http://schemas.openxmlformats.org/officeDocument/2006/customXml" ds:itemID="{098BBD3B-552B-475F-A5D7-1397CD30A595}">
+<ds:datastoreItem xmlns:ds="http://schemas.openxmlformats.org/officeDocument/2006/customXml" ds:itemID="{EB0F5724-F774-4D6C-914C-D041CB1B57B8}">
   <ds:schemaRefs>
     <ds:schemaRef ds:uri="http://schemas.openxmlformats.org/officeDocument/2006/bibliography"/>
   </ds:schemaRefs>

</xml_diff>